<commit_message>
using freehub for changing product to docx template engine
</commit_message>
<xml_diff>
--- a/Physics_cleaned_dataset.docx
+++ b/Physics_cleaned_dataset.docx
@@ -93,41 +93,25 @@
         <w:rPr>
           <w:rFonts w:cs="Times New Roman"/>
         </w:rPr>
-        <w:t>[</w:t>
-      </w:r>
-      <w:proofErr w:type="spellStart"/>
-      <w:r>
-        <w:rPr>
-          <w:rFonts w:cs="Times New Roman"/>
-        </w:rPr>
-        <w:t>Question_start</w:t>
-      </w:r>
-      <w:proofErr w:type="spellEnd"/>
-      <w:r>
-        <w:rPr>
-          <w:rFonts w:cs="Times New Roman"/>
-        </w:rPr>
-        <w:t>]</w:t>
-      </w:r>
-    </w:p>
-    <w:p>
-      <w:pPr>
-        <w:tabs>
-          <w:tab w:val="left" w:pos="709"/>
-          <w:tab w:val="left" w:pos="1134"/>
-          <w:tab w:val="left" w:pos="2694"/>
-        </w:tabs>
-        <w:spacing w:after="0"/>
-        <w:ind w:left="709" w:hanging="709"/>
-        <w:rPr>
-          <w:rFonts w:cs="Times New Roman"/>
-        </w:rPr>
-      </w:pPr>
-      <w:r>
-        <w:rPr>
-          <w:rFonts w:cs="Times New Roman"/>
-        </w:rPr>
-        <w:t xml:space="preserve">1. </w:t>
+        <w:t>Q</w:t>
+      </w:r>
+      <w:r>
+        <w:rPr>
+          <w:rFonts w:cs="Times New Roman"/>
+        </w:rPr>
+        <w:t>1</w:t>
+      </w:r>
+      <w:r>
+        <w:rPr>
+          <w:rFonts w:cs="Times New Roman"/>
+        </w:rPr>
+        <w:t>)</w:t>
+      </w:r>
+      <w:r>
+        <w:rPr>
+          <w:rFonts w:cs="Times New Roman"/>
+        </w:rPr>
+        <w:t xml:space="preserve"> </w:t>
       </w:r>
       <w:r>
         <w:rPr>
@@ -285,21 +269,7 @@
         <w:rPr>
           <w:rFonts w:cs="Times New Roman"/>
         </w:rPr>
-        <w:t xml:space="preserve"> are charge densities at given points then, choose the correct answer from the </w:t>
-      </w:r>
-      <w:proofErr w:type="spellStart"/>
-      <w:r>
-        <w:rPr>
-          <w:rFonts w:cs="Times New Roman"/>
-        </w:rPr>
-        <w:t>opions</w:t>
-      </w:r>
-      <w:proofErr w:type="spellEnd"/>
-      <w:r>
-        <w:rPr>
-          <w:rFonts w:cs="Times New Roman"/>
-        </w:rPr>
-        <w:t xml:space="preserve"> given below:</w:t>
+        <w:t xml:space="preserve"> are charge densities at given points then, choose the correct answer from the opions given below:</w:t>
       </w:r>
       <w:r>
         <w:rPr>
@@ -1247,7 +1217,7 @@
         <w:rPr>
           <w:rFonts w:cs="Times New Roman"/>
         </w:rPr>
-        <w:t>[solution]</w:t>
+        <w:t>Answer: A</w:t>
       </w:r>
     </w:p>
     <w:p>
@@ -1267,8 +1237,34 @@
         <w:rPr>
           <w:rFonts w:cs="Times New Roman"/>
         </w:rPr>
+        <w:t>Explanation:</w:t>
+      </w:r>
+    </w:p>
+    <w:p>
+      <w:pPr>
+        <w:tabs>
+          <w:tab w:val="left" w:pos="709"/>
+          <w:tab w:val="left" w:pos="1134"/>
+          <w:tab w:val="left" w:pos="2694"/>
+        </w:tabs>
+        <w:spacing w:before="0" w:after="0"/>
+        <w:ind w:left="709" w:hanging="709"/>
+        <w:rPr>
+          <w:rFonts w:cs="Times New Roman"/>
+        </w:rPr>
+      </w:pPr>
+      <w:r>
+        <w:rPr>
+          <w:rFonts w:cs="Times New Roman"/>
+        </w:rPr>
         <w:t>Option A</w:t>
       </w:r>
+      <w:r>
+        <w:rPr>
+          <w:rFonts w:cs="Times New Roman"/>
+        </w:rPr>
+        <w:t xml:space="preserve"> is correct answer</w:t>
+      </w:r>
     </w:p>
     <w:p>
       <w:pPr>
@@ -1283,40 +1279,6 @@
           <w:rFonts w:cs="Times New Roman"/>
         </w:rPr>
       </w:pPr>
-      <w:r>
-        <w:rPr>
-          <w:rFonts w:cs="Times New Roman"/>
-        </w:rPr>
-        <w:t>[</w:t>
-      </w:r>
-      <w:proofErr w:type="spellStart"/>
-      <w:r>
-        <w:rPr>
-          <w:rFonts w:cs="Times New Roman"/>
-        </w:rPr>
-        <w:t>Question_end</w:t>
-      </w:r>
-      <w:proofErr w:type="spellEnd"/>
-      <w:r>
-        <w:rPr>
-          <w:rFonts w:cs="Times New Roman"/>
-        </w:rPr>
-        <w:t>]</w:t>
-      </w:r>
-    </w:p>
-    <w:p>
-      <w:pPr>
-        <w:tabs>
-          <w:tab w:val="left" w:pos="709"/>
-          <w:tab w:val="left" w:pos="1134"/>
-          <w:tab w:val="left" w:pos="2694"/>
-        </w:tabs>
-        <w:spacing w:before="0" w:after="0"/>
-        <w:ind w:left="709" w:hanging="709"/>
-        <w:rPr>
-          <w:rFonts w:cs="Times New Roman"/>
-        </w:rPr>
-      </w:pPr>
     </w:p>
     <w:p>
       <w:pPr>
@@ -1335,41 +1297,25 @@
         <w:rPr>
           <w:rFonts w:cs="Times New Roman"/>
         </w:rPr>
-        <w:t>[</w:t>
-      </w:r>
-      <w:proofErr w:type="spellStart"/>
-      <w:r>
-        <w:rPr>
-          <w:rFonts w:cs="Times New Roman"/>
-        </w:rPr>
-        <w:t>Question_start</w:t>
-      </w:r>
-      <w:proofErr w:type="spellEnd"/>
-      <w:r>
-        <w:rPr>
-          <w:rFonts w:cs="Times New Roman"/>
-        </w:rPr>
-        <w:t>]</w:t>
-      </w:r>
-    </w:p>
-    <w:p>
-      <w:pPr>
-        <w:tabs>
-          <w:tab w:val="left" w:pos="709"/>
-          <w:tab w:val="left" w:pos="1134"/>
-          <w:tab w:val="left" w:pos="2694"/>
-        </w:tabs>
-        <w:spacing w:after="0"/>
-        <w:ind w:left="709" w:hanging="709"/>
-        <w:rPr>
-          <w:rFonts w:cs="Times New Roman"/>
-        </w:rPr>
-      </w:pPr>
-      <w:r>
-        <w:rPr>
-          <w:rFonts w:cs="Times New Roman"/>
-        </w:rPr>
-        <w:t xml:space="preserve">2. </w:t>
+        <w:t>Q</w:t>
+      </w:r>
+      <w:r>
+        <w:rPr>
+          <w:rFonts w:cs="Times New Roman"/>
+        </w:rPr>
+        <w:t>2</w:t>
+      </w:r>
+      <w:r>
+        <w:rPr>
+          <w:rFonts w:cs="Times New Roman"/>
+        </w:rPr>
+        <w:t>)</w:t>
+      </w:r>
+      <w:r>
+        <w:rPr>
+          <w:rFonts w:cs="Times New Roman"/>
+        </w:rPr>
+        <w:t xml:space="preserve"> </w:t>
       </w:r>
       <w:r>
         <w:rPr>
@@ -1413,21 +1359,7 @@
         <w:rPr>
           <w:rFonts w:cs="Times New Roman"/>
         </w:rPr>
-        <w:t xml:space="preserve"> is connected to an </w:t>
-      </w:r>
-      <w:proofErr w:type="gramStart"/>
-      <w:r>
-        <w:rPr>
-          <w:rFonts w:cs="Times New Roman"/>
-        </w:rPr>
-        <w:t>insulating</w:t>
-      </w:r>
-      <w:proofErr w:type="gramEnd"/>
-      <w:r>
-        <w:rPr>
-          <w:rFonts w:cs="Times New Roman"/>
-        </w:rPr>
-        <w:t xml:space="preserve"> string of length 1 m . It is brought near to an infinitely long non-conducting sheet of charge density ' </w:t>
+        <w:t xml:space="preserve"> is connected to an insulating string of length 1 m . It is brought near to an infinitely long non-conducting sheet of charge density ' </w:t>
       </w:r>
       <m:oMath>
         <m:r>
@@ -1951,7 +1883,7 @@
         <w:rPr>
           <w:rFonts w:cs="Times New Roman"/>
         </w:rPr>
-        <w:t>[solution]</w:t>
+        <w:t>Answer: A</w:t>
       </w:r>
     </w:p>
     <w:p>
@@ -1971,7 +1903,7 @@
         <w:rPr>
           <w:rFonts w:cs="Times New Roman"/>
         </w:rPr>
-        <w:t>Option A</w:t>
+        <w:t>Explanation:</w:t>
       </w:r>
     </w:p>
     <w:p>
@@ -1991,36 +1923,8 @@
         <w:rPr>
           <w:rFonts w:cs="Times New Roman"/>
         </w:rPr>
-        <w:t>[</w:t>
-      </w:r>
-      <w:proofErr w:type="spellStart"/>
-      <w:r>
-        <w:rPr>
-          <w:rFonts w:cs="Times New Roman"/>
-        </w:rPr>
-        <w:t>Question_end</w:t>
-      </w:r>
-      <w:proofErr w:type="spellEnd"/>
-      <w:r>
-        <w:rPr>
-          <w:rFonts w:cs="Times New Roman"/>
-        </w:rPr>
-        <w:t>]</w:t>
-      </w:r>
-    </w:p>
-    <w:p>
-      <w:pPr>
-        <w:tabs>
-          <w:tab w:val="left" w:pos="709"/>
-          <w:tab w:val="left" w:pos="1134"/>
-          <w:tab w:val="left" w:pos="2694"/>
-        </w:tabs>
-        <w:spacing w:before="0" w:after="0"/>
-        <w:ind w:left="709" w:hanging="709"/>
-        <w:rPr>
-          <w:rFonts w:cs="Times New Roman"/>
-        </w:rPr>
-      </w:pPr>
+        <w:t>Option A is correct answer</w:t>
+      </w:r>
     </w:p>
     <w:p>
       <w:pPr>
@@ -2035,26 +1939,6 @@
           <w:rFonts w:cs="Times New Roman"/>
         </w:rPr>
       </w:pPr>
-      <w:r>
-        <w:rPr>
-          <w:rFonts w:cs="Times New Roman"/>
-        </w:rPr>
-        <w:t>[</w:t>
-      </w:r>
-      <w:proofErr w:type="spellStart"/>
-      <w:r>
-        <w:rPr>
-          <w:rFonts w:cs="Times New Roman"/>
-        </w:rPr>
-        <w:t>Question_start</w:t>
-      </w:r>
-      <w:proofErr w:type="spellEnd"/>
-      <w:r>
-        <w:rPr>
-          <w:rFonts w:cs="Times New Roman"/>
-        </w:rPr>
-        <w:t>]</w:t>
-      </w:r>
     </w:p>
     <w:p>
       <w:pPr>
@@ -2073,7 +1957,25 @@
         <w:rPr>
           <w:rFonts w:cs="Times New Roman"/>
         </w:rPr>
-        <w:t xml:space="preserve">3. </w:t>
+        <w:t>Q</w:t>
+      </w:r>
+      <w:r>
+        <w:rPr>
+          <w:rFonts w:cs="Times New Roman"/>
+        </w:rPr>
+        <w:t>3</w:t>
+      </w:r>
+      <w:r>
+        <w:rPr>
+          <w:rFonts w:cs="Times New Roman"/>
+        </w:rPr>
+        <w:t>)</w:t>
+      </w:r>
+      <w:r>
+        <w:rPr>
+          <w:rFonts w:cs="Times New Roman"/>
+        </w:rPr>
+        <w:t xml:space="preserve"> </w:t>
       </w:r>
       <w:r>
         <w:rPr>
@@ -2401,7 +2303,6 @@
         <w:rPr>
           <w:rFonts w:cs="Times New Roman"/>
         </w:rPr>
-        <w:lastRenderedPageBreak/>
         <w:tab/>
       </w:r>
       <w:r>
@@ -2478,7 +2379,7 @@
         <w:rPr>
           <w:rFonts w:cs="Times New Roman"/>
         </w:rPr>
-        <w:t>[solution]</w:t>
+        <w:t>Answer: A</w:t>
       </w:r>
     </w:p>
     <w:p>
@@ -2498,7 +2399,7 @@
         <w:rPr>
           <w:rFonts w:cs="Times New Roman"/>
         </w:rPr>
-        <w:t>Option A</w:t>
+        <w:t>Explanation:</w:t>
       </w:r>
     </w:p>
     <w:p>
@@ -2518,21 +2419,8 @@
         <w:rPr>
           <w:rFonts w:cs="Times New Roman"/>
         </w:rPr>
-        <w:t>[</w:t>
-      </w:r>
-      <w:proofErr w:type="spellStart"/>
-      <w:r>
-        <w:rPr>
-          <w:rFonts w:cs="Times New Roman"/>
-        </w:rPr>
-        <w:t>Question_end</w:t>
-      </w:r>
-      <w:proofErr w:type="spellEnd"/>
-      <w:r>
-        <w:rPr>
-          <w:rFonts w:cs="Times New Roman"/>
-        </w:rPr>
-        <w:t>]</w:t>
+        <w:lastRenderedPageBreak/>
+        <w:t>Option A is correct answer</w:t>
       </w:r>
     </w:p>
     <w:p>
@@ -2556,40 +2444,6 @@
           <w:tab w:val="left" w:pos="1134"/>
           <w:tab w:val="left" w:pos="2694"/>
         </w:tabs>
-        <w:spacing w:before="0" w:after="0"/>
-        <w:ind w:left="709" w:hanging="709"/>
-        <w:rPr>
-          <w:rFonts w:cs="Times New Roman"/>
-        </w:rPr>
-      </w:pPr>
-      <w:r>
-        <w:rPr>
-          <w:rFonts w:cs="Times New Roman"/>
-        </w:rPr>
-        <w:t>[</w:t>
-      </w:r>
-      <w:proofErr w:type="spellStart"/>
-      <w:r>
-        <w:rPr>
-          <w:rFonts w:cs="Times New Roman"/>
-        </w:rPr>
-        <w:t>Question_start</w:t>
-      </w:r>
-      <w:proofErr w:type="spellEnd"/>
-      <w:r>
-        <w:rPr>
-          <w:rFonts w:cs="Times New Roman"/>
-        </w:rPr>
-        <w:t>]</w:t>
-      </w:r>
-    </w:p>
-    <w:p>
-      <w:pPr>
-        <w:tabs>
-          <w:tab w:val="left" w:pos="709"/>
-          <w:tab w:val="left" w:pos="1134"/>
-          <w:tab w:val="left" w:pos="2694"/>
-        </w:tabs>
         <w:spacing w:after="0"/>
         <w:ind w:left="709" w:hanging="709"/>
         <w:rPr>
@@ -2600,7 +2454,25 @@
         <w:rPr>
           <w:rFonts w:cs="Times New Roman"/>
         </w:rPr>
-        <w:t xml:space="preserve">4. </w:t>
+        <w:t>Q</w:t>
+      </w:r>
+      <w:r>
+        <w:rPr>
+          <w:rFonts w:cs="Times New Roman"/>
+        </w:rPr>
+        <w:t>4</w:t>
+      </w:r>
+      <w:r>
+        <w:rPr>
+          <w:rFonts w:cs="Times New Roman"/>
+        </w:rPr>
+        <w:t>)</w:t>
+      </w:r>
+      <w:r>
+        <w:rPr>
+          <w:rFonts w:cs="Times New Roman"/>
+        </w:rPr>
+        <w:t xml:space="preserve"> </w:t>
       </w:r>
       <w:r>
         <w:rPr>
@@ -2785,7 +2657,7 @@
         <w:rPr>
           <w:rFonts w:cs="Times New Roman"/>
         </w:rPr>
-        <w:t>[solution]</w:t>
+        <w:t>Answer: A</w:t>
       </w:r>
     </w:p>
     <w:p>
@@ -2805,7 +2677,7 @@
         <w:rPr>
           <w:rFonts w:cs="Times New Roman"/>
         </w:rPr>
-        <w:t>Option A</w:t>
+        <w:t>Explanation:</w:t>
       </w:r>
     </w:p>
     <w:p>
@@ -2825,21 +2697,7 @@
         <w:rPr>
           <w:rFonts w:cs="Times New Roman"/>
         </w:rPr>
-        <w:t>[</w:t>
-      </w:r>
-      <w:proofErr w:type="spellStart"/>
-      <w:r>
-        <w:rPr>
-          <w:rFonts w:cs="Times New Roman"/>
-        </w:rPr>
-        <w:t>Question_end</w:t>
-      </w:r>
-      <w:proofErr w:type="spellEnd"/>
-      <w:r>
-        <w:rPr>
-          <w:rFonts w:cs="Times New Roman"/>
-        </w:rPr>
-        <w:t>]</w:t>
+        <w:t>Option A is correct answer</w:t>
       </w:r>
     </w:p>
     <w:p>
@@ -2863,40 +2721,6 @@
           <w:tab w:val="left" w:pos="1134"/>
           <w:tab w:val="left" w:pos="2694"/>
         </w:tabs>
-        <w:spacing w:before="0" w:after="0"/>
-        <w:ind w:left="709" w:hanging="709"/>
-        <w:rPr>
-          <w:rFonts w:cs="Times New Roman"/>
-        </w:rPr>
-      </w:pPr>
-      <w:r>
-        <w:rPr>
-          <w:rFonts w:cs="Times New Roman"/>
-        </w:rPr>
-        <w:t>[</w:t>
-      </w:r>
-      <w:proofErr w:type="spellStart"/>
-      <w:r>
-        <w:rPr>
-          <w:rFonts w:cs="Times New Roman"/>
-        </w:rPr>
-        <w:t>Question_start</w:t>
-      </w:r>
-      <w:proofErr w:type="spellEnd"/>
-      <w:r>
-        <w:rPr>
-          <w:rFonts w:cs="Times New Roman"/>
-        </w:rPr>
-        <w:t>]</w:t>
-      </w:r>
-    </w:p>
-    <w:p>
-      <w:pPr>
-        <w:tabs>
-          <w:tab w:val="left" w:pos="709"/>
-          <w:tab w:val="left" w:pos="1134"/>
-          <w:tab w:val="left" w:pos="2694"/>
-        </w:tabs>
         <w:spacing w:after="0"/>
         <w:ind w:left="709" w:hanging="709"/>
         <w:rPr>
@@ -2907,7 +2731,25 @@
         <w:rPr>
           <w:rFonts w:cs="Times New Roman"/>
         </w:rPr>
-        <w:t xml:space="preserve">5. </w:t>
+        <w:t>Q</w:t>
+      </w:r>
+      <w:r>
+        <w:rPr>
+          <w:rFonts w:cs="Times New Roman"/>
+        </w:rPr>
+        <w:t>5</w:t>
+      </w:r>
+      <w:r>
+        <w:rPr>
+          <w:rFonts w:cs="Times New Roman"/>
+        </w:rPr>
+        <w:t>)</w:t>
+      </w:r>
+      <w:r>
+        <w:rPr>
+          <w:rFonts w:cs="Times New Roman"/>
+        </w:rPr>
+        <w:t xml:space="preserve"> </w:t>
       </w:r>
       <w:r>
         <w:rPr>
@@ -3214,7 +3056,7 @@
         <w:rPr>
           <w:rFonts w:cs="Times New Roman"/>
         </w:rPr>
-        <w:t>[solution]</w:t>
+        <w:t>Answer: A</w:t>
       </w:r>
     </w:p>
     <w:p>
@@ -3234,7 +3076,7 @@
         <w:rPr>
           <w:rFonts w:cs="Times New Roman"/>
         </w:rPr>
-        <w:t>Option A</w:t>
+        <w:t>Explanation:</w:t>
       </w:r>
     </w:p>
     <w:p>
@@ -3254,21 +3096,7 @@
         <w:rPr>
           <w:rFonts w:cs="Times New Roman"/>
         </w:rPr>
-        <w:t>[</w:t>
-      </w:r>
-      <w:proofErr w:type="spellStart"/>
-      <w:r>
-        <w:rPr>
-          <w:rFonts w:cs="Times New Roman"/>
-        </w:rPr>
-        <w:t>Question_end</w:t>
-      </w:r>
-      <w:proofErr w:type="spellEnd"/>
-      <w:r>
-        <w:rPr>
-          <w:rFonts w:cs="Times New Roman"/>
-        </w:rPr>
-        <w:t>]</w:t>
+        <w:t>Option A is correct answer</w:t>
       </w:r>
     </w:p>
     <w:p>
@@ -3292,40 +3120,6 @@
           <w:tab w:val="left" w:pos="1134"/>
           <w:tab w:val="left" w:pos="2694"/>
         </w:tabs>
-        <w:spacing w:before="0" w:after="0"/>
-        <w:ind w:left="709" w:hanging="709"/>
-        <w:rPr>
-          <w:rFonts w:cs="Times New Roman"/>
-        </w:rPr>
-      </w:pPr>
-      <w:r>
-        <w:rPr>
-          <w:rFonts w:cs="Times New Roman"/>
-        </w:rPr>
-        <w:t>[</w:t>
-      </w:r>
-      <w:proofErr w:type="spellStart"/>
-      <w:r>
-        <w:rPr>
-          <w:rFonts w:cs="Times New Roman"/>
-        </w:rPr>
-        <w:t>Question_start</w:t>
-      </w:r>
-      <w:proofErr w:type="spellEnd"/>
-      <w:r>
-        <w:rPr>
-          <w:rFonts w:cs="Times New Roman"/>
-        </w:rPr>
-        <w:t>]</w:t>
-      </w:r>
-    </w:p>
-    <w:p>
-      <w:pPr>
-        <w:tabs>
-          <w:tab w:val="left" w:pos="709"/>
-          <w:tab w:val="left" w:pos="1134"/>
-          <w:tab w:val="left" w:pos="2694"/>
-        </w:tabs>
         <w:spacing w:after="0"/>
         <w:ind w:left="709" w:hanging="709"/>
         <w:rPr>
@@ -3336,7 +3130,25 @@
         <w:rPr>
           <w:rFonts w:cs="Times New Roman"/>
         </w:rPr>
-        <w:t xml:space="preserve">6. </w:t>
+        <w:t>Q</w:t>
+      </w:r>
+      <w:r>
+        <w:rPr>
+          <w:rFonts w:cs="Times New Roman"/>
+        </w:rPr>
+        <w:t>6</w:t>
+      </w:r>
+      <w:r>
+        <w:rPr>
+          <w:rFonts w:cs="Times New Roman"/>
+        </w:rPr>
+        <w:t>)</w:t>
+      </w:r>
+      <w:r>
+        <w:rPr>
+          <w:rFonts w:cs="Times New Roman"/>
+        </w:rPr>
+        <w:t xml:space="preserve"> </w:t>
       </w:r>
       <w:r>
         <w:rPr>
@@ -3380,21 +3192,7 @@
         <w:rPr>
           <w:rFonts w:cs="Times New Roman"/>
         </w:rPr>
-        <w:t xml:space="preserve"> charge is divided into two parts and placed at 1 cm distance so that the repulsive force between them is maximum. The charges of the two parts </w:t>
-      </w:r>
-      <w:proofErr w:type="gramStart"/>
-      <w:r>
-        <w:rPr>
-          <w:rFonts w:cs="Times New Roman"/>
-        </w:rPr>
-        <w:t xml:space="preserve">are </w:t>
-      </w:r>
-      <w:proofErr w:type="gramEnd"/>
-      <w:r>
-        <w:rPr>
-          <w:rFonts w:cs="Times New Roman"/>
-        </w:rPr>
-        <w:t>:</w:t>
+        <w:t xml:space="preserve"> charge is divided into two parts and placed at 1 cm distance so that the repulsive force between them is maximum. The charges of the two parts are :</w:t>
       </w:r>
     </w:p>
     <w:p>
@@ -3663,7 +3461,7 @@
         <w:rPr>
           <w:rFonts w:cs="Times New Roman"/>
         </w:rPr>
-        <w:t>[solution]</w:t>
+        <w:t>Answer: A</w:t>
       </w:r>
     </w:p>
     <w:p>
@@ -3683,7 +3481,7 @@
         <w:rPr>
           <w:rFonts w:cs="Times New Roman"/>
         </w:rPr>
-        <w:t>Option A</w:t>
+        <w:t>Explanation:</w:t>
       </w:r>
     </w:p>
     <w:p>
@@ -3703,21 +3501,7 @@
         <w:rPr>
           <w:rFonts w:cs="Times New Roman"/>
         </w:rPr>
-        <w:t>[</w:t>
-      </w:r>
-      <w:proofErr w:type="spellStart"/>
-      <w:r>
-        <w:rPr>
-          <w:rFonts w:cs="Times New Roman"/>
-        </w:rPr>
-        <w:t>Question_end</w:t>
-      </w:r>
-      <w:proofErr w:type="spellEnd"/>
-      <w:r>
-        <w:rPr>
-          <w:rFonts w:cs="Times New Roman"/>
-        </w:rPr>
-        <w:t>]</w:t>
+        <w:t>Option A is correct answer</w:t>
       </w:r>
     </w:p>
     <w:p>
@@ -3741,40 +3525,6 @@
           <w:tab w:val="left" w:pos="1134"/>
           <w:tab w:val="left" w:pos="2694"/>
         </w:tabs>
-        <w:spacing w:before="0" w:after="0"/>
-        <w:ind w:left="709" w:hanging="709"/>
-        <w:rPr>
-          <w:rFonts w:cs="Times New Roman"/>
-        </w:rPr>
-      </w:pPr>
-      <w:r>
-        <w:rPr>
-          <w:rFonts w:cs="Times New Roman"/>
-        </w:rPr>
-        <w:t>[</w:t>
-      </w:r>
-      <w:proofErr w:type="spellStart"/>
-      <w:r>
-        <w:rPr>
-          <w:rFonts w:cs="Times New Roman"/>
-        </w:rPr>
-        <w:t>Question_start</w:t>
-      </w:r>
-      <w:proofErr w:type="spellEnd"/>
-      <w:r>
-        <w:rPr>
-          <w:rFonts w:cs="Times New Roman"/>
-        </w:rPr>
-        <w:t>]</w:t>
-      </w:r>
-    </w:p>
-    <w:p>
-      <w:pPr>
-        <w:tabs>
-          <w:tab w:val="left" w:pos="709"/>
-          <w:tab w:val="left" w:pos="1134"/>
-          <w:tab w:val="left" w:pos="2694"/>
-        </w:tabs>
         <w:spacing w:after="0"/>
         <w:ind w:left="709" w:hanging="709"/>
         <w:rPr>
@@ -3785,7 +3535,25 @@
         <w:rPr>
           <w:rFonts w:cs="Times New Roman"/>
         </w:rPr>
-        <w:t xml:space="preserve">7. </w:t>
+        <w:t>Q</w:t>
+      </w:r>
+      <w:r>
+        <w:rPr>
+          <w:rFonts w:cs="Times New Roman"/>
+        </w:rPr>
+        <w:t>7</w:t>
+      </w:r>
+      <w:r>
+        <w:rPr>
+          <w:rFonts w:cs="Times New Roman"/>
+        </w:rPr>
+        <w:t>)</w:t>
+      </w:r>
+      <w:r>
+        <w:rPr>
+          <w:rFonts w:cs="Times New Roman"/>
+        </w:rPr>
+        <w:t xml:space="preserve"> </w:t>
       </w:r>
       <w:r>
         <w:rPr>
@@ -4128,7 +3896,7 @@
         <w:rPr>
           <w:rFonts w:cs="Times New Roman"/>
         </w:rPr>
-        <w:t>[solution]</w:t>
+        <w:t>Answer: A</w:t>
       </w:r>
     </w:p>
     <w:p>
@@ -4148,7 +3916,7 @@
         <w:rPr>
           <w:rFonts w:cs="Times New Roman"/>
         </w:rPr>
-        <w:t>Option A</w:t>
+        <w:t>Explanation:</w:t>
       </w:r>
     </w:p>
     <w:p>
@@ -4168,194 +3936,150 @@
         <w:rPr>
           <w:rFonts w:cs="Times New Roman"/>
         </w:rPr>
+        <w:t>Option A is correct answer</w:t>
+      </w:r>
+    </w:p>
+    <w:p>
+      <w:pPr>
+        <w:tabs>
+          <w:tab w:val="left" w:pos="709"/>
+          <w:tab w:val="left" w:pos="1134"/>
+          <w:tab w:val="left" w:pos="2694"/>
+        </w:tabs>
+        <w:spacing w:before="0" w:after="0"/>
+        <w:ind w:left="709" w:hanging="709"/>
+        <w:rPr>
+          <w:rFonts w:cs="Times New Roman"/>
+        </w:rPr>
+      </w:pPr>
+    </w:p>
+    <w:p>
+      <w:pPr>
+        <w:tabs>
+          <w:tab w:val="left" w:pos="709"/>
+          <w:tab w:val="left" w:pos="1134"/>
+          <w:tab w:val="left" w:pos="2694"/>
+        </w:tabs>
+        <w:spacing w:after="0"/>
+        <w:ind w:left="709" w:hanging="709"/>
+        <w:rPr>
+          <w:rFonts w:cs="Times New Roman"/>
+        </w:rPr>
+      </w:pPr>
+      <w:r>
+        <w:rPr>
+          <w:rFonts w:cs="Times New Roman"/>
+        </w:rPr>
+        <w:t>Q</w:t>
+      </w:r>
+      <w:r>
+        <w:rPr>
+          <w:rFonts w:cs="Times New Roman"/>
+        </w:rPr>
+        <w:t>8</w:t>
+      </w:r>
+      <w:r>
+        <w:rPr>
+          <w:rFonts w:cs="Times New Roman"/>
+        </w:rPr>
+        <w:t>)</w:t>
+      </w:r>
+      <w:r>
+        <w:rPr>
+          <w:rFonts w:cs="Times New Roman"/>
+        </w:rPr>
+        <w:t xml:space="preserve"> </w:t>
+      </w:r>
+      <w:r>
+        <w:rPr>
+          <w:rFonts w:cs="Times New Roman"/>
+        </w:rPr>
+        <w:tab/>
+      </w:r>
+      <w:r>
+        <w:rPr>
+          <w:rFonts w:cs="Times New Roman"/>
+        </w:rPr>
+        <w:t>Two identical metallic spheres A and B when placed at certain distance in air repel each</w:t>
+      </w:r>
+      <w:r>
+        <w:rPr>
+          <w:rFonts w:cs="Times New Roman"/>
+        </w:rPr>
+        <w:t xml:space="preserve"> </w:t>
+      </w:r>
+      <w:r>
+        <w:rPr>
+          <w:rFonts w:cs="Times New Roman"/>
+        </w:rPr>
+        <w:t xml:space="preserve">other with a force of F . Another identical uncharged sphere </w:t>
+      </w:r>
+      <m:oMath>
+        <m:r>
+          <w:rPr>
+            <w:rFonts w:ascii="Cambria Math" w:hAnsi="Cambria Math" w:cs="Times New Roman"/>
+          </w:rPr>
+          <m:t>C</m:t>
+        </m:r>
+      </m:oMath>
+      <w:r>
+        <w:rPr>
+          <w:rFonts w:cs="Times New Roman"/>
+        </w:rPr>
+        <w:t xml:space="preserve"> is first placed in contact with A and then in contact with B and finally placed at midpoint between spheres A and B . The force experienced by sphere C will be :</w:t>
+      </w:r>
+    </w:p>
+    <w:p>
+      <w:pPr>
+        <w:tabs>
+          <w:tab w:val="left" w:pos="709"/>
+          <w:tab w:val="left" w:pos="1134"/>
+          <w:tab w:val="left" w:pos="2694"/>
+        </w:tabs>
+        <w:spacing w:before="0" w:after="0"/>
+        <w:ind w:left="709" w:hanging="709"/>
+        <w:jc w:val="right"/>
+        <w:rPr>
+          <w:rFonts w:cs="Times New Roman"/>
+        </w:rPr>
+      </w:pPr>
+      <w:r>
+        <w:rPr>
+          <w:rFonts w:cs="Times New Roman"/>
+        </w:rPr>
+        <w:t>[</w:t>
+      </w:r>
+      <w:r>
+        <w:rPr>
+          <w:rFonts w:cs="Times New Roman"/>
+        </w:rPr>
+        <w:t>July 29, 2022 (II)</w:t>
+      </w:r>
+      <w:r>
+        <w:rPr>
+          <w:rFonts w:cs="Times New Roman"/>
+        </w:rPr>
+        <w:t>]</w:t>
+      </w:r>
+    </w:p>
+    <w:p>
+      <w:pPr>
+        <w:tabs>
+          <w:tab w:val="left" w:pos="709"/>
+          <w:tab w:val="left" w:pos="1134"/>
+          <w:tab w:val="left" w:pos="2694"/>
+        </w:tabs>
+        <w:spacing w:before="0" w:after="0"/>
+        <w:ind w:left="709" w:hanging="709"/>
+        <w:rPr>
+          <w:rFonts w:cs="Times New Roman"/>
+        </w:rPr>
+      </w:pPr>
+      <w:r>
+        <w:rPr>
+          <w:rFonts w:cs="Times New Roman"/>
+        </w:rPr>
         <w:lastRenderedPageBreak/>
-        <w:t>[</w:t>
-      </w:r>
-      <w:proofErr w:type="spellStart"/>
-      <w:r>
-        <w:rPr>
-          <w:rFonts w:cs="Times New Roman"/>
-        </w:rPr>
-        <w:t>Question_end</w:t>
-      </w:r>
-      <w:proofErr w:type="spellEnd"/>
-      <w:r>
-        <w:rPr>
-          <w:rFonts w:cs="Times New Roman"/>
-        </w:rPr>
-        <w:t>]</w:t>
-      </w:r>
-    </w:p>
-    <w:p>
-      <w:pPr>
-        <w:tabs>
-          <w:tab w:val="left" w:pos="709"/>
-          <w:tab w:val="left" w:pos="1134"/>
-          <w:tab w:val="left" w:pos="2694"/>
-        </w:tabs>
-        <w:spacing w:before="0" w:after="0"/>
-        <w:ind w:left="709" w:hanging="709"/>
-        <w:rPr>
-          <w:rFonts w:eastAsiaTheme="minorEastAsia" w:cs="Times New Roman"/>
-        </w:rPr>
-      </w:pPr>
-    </w:p>
-    <w:p>
-      <w:pPr>
-        <w:tabs>
-          <w:tab w:val="left" w:pos="709"/>
-          <w:tab w:val="left" w:pos="1134"/>
-          <w:tab w:val="left" w:pos="2694"/>
-        </w:tabs>
-        <w:spacing w:before="0" w:after="0"/>
-        <w:ind w:left="709" w:hanging="709"/>
-        <w:rPr>
-          <w:rFonts w:cs="Times New Roman"/>
-        </w:rPr>
-      </w:pPr>
-      <w:r>
-        <w:rPr>
-          <w:rFonts w:cs="Times New Roman"/>
-        </w:rPr>
-        <w:t>[</w:t>
-      </w:r>
-      <w:proofErr w:type="spellStart"/>
-      <w:r>
-        <w:rPr>
-          <w:rFonts w:cs="Times New Roman"/>
-        </w:rPr>
-        <w:t>Question_start</w:t>
-      </w:r>
-      <w:proofErr w:type="spellEnd"/>
-      <w:r>
-        <w:rPr>
-          <w:rFonts w:cs="Times New Roman"/>
-        </w:rPr>
-        <w:t>]</w:t>
-      </w:r>
-    </w:p>
-    <w:p>
-      <w:pPr>
-        <w:tabs>
-          <w:tab w:val="left" w:pos="709"/>
-          <w:tab w:val="left" w:pos="1134"/>
-          <w:tab w:val="left" w:pos="2694"/>
-        </w:tabs>
-        <w:spacing w:after="0"/>
-        <w:ind w:left="709" w:hanging="709"/>
-        <w:rPr>
-          <w:rFonts w:cs="Times New Roman"/>
-        </w:rPr>
-      </w:pPr>
-      <w:r>
-        <w:rPr>
-          <w:rFonts w:cs="Times New Roman"/>
-        </w:rPr>
-        <w:t xml:space="preserve">8. </w:t>
-      </w:r>
-      <w:r>
-        <w:rPr>
-          <w:rFonts w:cs="Times New Roman"/>
-        </w:rPr>
-        <w:tab/>
-      </w:r>
-      <w:r>
-        <w:rPr>
-          <w:rFonts w:cs="Times New Roman"/>
-        </w:rPr>
-        <w:t>Two identical metallic spheres A and B when placed at certain distance in air repel each</w:t>
-      </w:r>
-      <w:r>
-        <w:rPr>
-          <w:rFonts w:cs="Times New Roman"/>
-        </w:rPr>
-        <w:t xml:space="preserve"> </w:t>
-      </w:r>
-      <w:r>
-        <w:rPr>
-          <w:rFonts w:cs="Times New Roman"/>
-        </w:rPr>
-        <w:t xml:space="preserve">other with a force of F . Another identical uncharged sphere </w:t>
-      </w:r>
-      <m:oMath>
-        <m:r>
-          <w:rPr>
-            <w:rFonts w:ascii="Cambria Math" w:hAnsi="Cambria Math" w:cs="Times New Roman"/>
-          </w:rPr>
-          <m:t>C</m:t>
-        </m:r>
-      </m:oMath>
-      <w:r>
-        <w:rPr>
-          <w:rFonts w:cs="Times New Roman"/>
-        </w:rPr>
-        <w:t xml:space="preserve"> is first placed in contact with A and then in contact with B and finally placed at midpoint between spheres A and B . The force experienced by sphere C will </w:t>
-      </w:r>
-      <w:proofErr w:type="gramStart"/>
-      <w:r>
-        <w:rPr>
-          <w:rFonts w:cs="Times New Roman"/>
-        </w:rPr>
-        <w:t xml:space="preserve">be </w:t>
-      </w:r>
-      <w:proofErr w:type="gramEnd"/>
-      <w:r>
-        <w:rPr>
-          <w:rFonts w:cs="Times New Roman"/>
-        </w:rPr>
-        <w:t>:</w:t>
-      </w:r>
-    </w:p>
-    <w:p>
-      <w:pPr>
-        <w:tabs>
-          <w:tab w:val="left" w:pos="709"/>
-          <w:tab w:val="left" w:pos="1134"/>
-          <w:tab w:val="left" w:pos="2694"/>
-        </w:tabs>
-        <w:spacing w:before="0" w:after="0"/>
-        <w:ind w:left="709" w:hanging="709"/>
-        <w:jc w:val="right"/>
-        <w:rPr>
-          <w:rFonts w:cs="Times New Roman"/>
-        </w:rPr>
-      </w:pPr>
-      <w:r>
-        <w:rPr>
-          <w:rFonts w:cs="Times New Roman"/>
-        </w:rPr>
-        <w:t>[</w:t>
-      </w:r>
-      <w:r>
-        <w:rPr>
-          <w:rFonts w:cs="Times New Roman"/>
-        </w:rPr>
-        <w:t>July 29, 2022 (II)</w:t>
-      </w:r>
-      <w:r>
-        <w:rPr>
-          <w:rFonts w:cs="Times New Roman"/>
-        </w:rPr>
-        <w:t>]</w:t>
-      </w:r>
-    </w:p>
-    <w:p>
-      <w:pPr>
-        <w:tabs>
-          <w:tab w:val="left" w:pos="709"/>
-          <w:tab w:val="left" w:pos="1134"/>
-          <w:tab w:val="left" w:pos="2694"/>
-        </w:tabs>
-        <w:spacing w:before="0" w:after="0"/>
-        <w:ind w:left="709" w:hanging="709"/>
-        <w:rPr>
-          <w:rFonts w:cs="Times New Roman"/>
-        </w:rPr>
-      </w:pPr>
-      <w:r>
-        <w:rPr>
-          <w:rFonts w:cs="Times New Roman"/>
-        </w:rPr>
         <w:tab/>
         <w:t xml:space="preserve">(A) </w:t>
       </w:r>
@@ -4470,7 +4194,7 @@
         <w:rPr>
           <w:rFonts w:cs="Times New Roman"/>
         </w:rPr>
-        <w:t>[solution]</w:t>
+        <w:t>Answer: A</w:t>
       </w:r>
     </w:p>
     <w:p>
@@ -4490,7 +4214,7 @@
         <w:rPr>
           <w:rFonts w:cs="Times New Roman"/>
         </w:rPr>
-        <w:t>Option A</w:t>
+        <w:t>Explanation:</w:t>
       </w:r>
     </w:p>
     <w:p>
@@ -4510,21 +4234,7 @@
         <w:rPr>
           <w:rFonts w:cs="Times New Roman"/>
         </w:rPr>
-        <w:t>[</w:t>
-      </w:r>
-      <w:proofErr w:type="spellStart"/>
-      <w:r>
-        <w:rPr>
-          <w:rFonts w:cs="Times New Roman"/>
-        </w:rPr>
-        <w:t>Question_end</w:t>
-      </w:r>
-      <w:proofErr w:type="spellEnd"/>
-      <w:r>
-        <w:rPr>
-          <w:rFonts w:cs="Times New Roman"/>
-        </w:rPr>
-        <w:t>]</w:t>
+        <w:t>Option A is correct answer</w:t>
       </w:r>
     </w:p>
     <w:p>
@@ -4548,40 +4258,6 @@
           <w:tab w:val="left" w:pos="1134"/>
           <w:tab w:val="left" w:pos="2694"/>
         </w:tabs>
-        <w:spacing w:before="0" w:after="0"/>
-        <w:ind w:left="709" w:hanging="709"/>
-        <w:rPr>
-          <w:rFonts w:cs="Times New Roman"/>
-        </w:rPr>
-      </w:pPr>
-      <w:r>
-        <w:rPr>
-          <w:rFonts w:cs="Times New Roman"/>
-        </w:rPr>
-        <w:t>[</w:t>
-      </w:r>
-      <w:proofErr w:type="spellStart"/>
-      <w:r>
-        <w:rPr>
-          <w:rFonts w:cs="Times New Roman"/>
-        </w:rPr>
-        <w:t>Question_start</w:t>
-      </w:r>
-      <w:proofErr w:type="spellEnd"/>
-      <w:r>
-        <w:rPr>
-          <w:rFonts w:cs="Times New Roman"/>
-        </w:rPr>
-        <w:t>]</w:t>
-      </w:r>
-    </w:p>
-    <w:p>
-      <w:pPr>
-        <w:tabs>
-          <w:tab w:val="left" w:pos="709"/>
-          <w:tab w:val="left" w:pos="1134"/>
-          <w:tab w:val="left" w:pos="2694"/>
-        </w:tabs>
         <w:spacing w:after="0"/>
         <w:ind w:left="709" w:hanging="709"/>
         <w:rPr>
@@ -4592,7 +4268,25 @@
         <w:rPr>
           <w:rFonts w:cs="Times New Roman"/>
         </w:rPr>
-        <w:t xml:space="preserve">9. </w:t>
+        <w:t>Q</w:t>
+      </w:r>
+      <w:r>
+        <w:rPr>
+          <w:rFonts w:cs="Times New Roman"/>
+        </w:rPr>
+        <w:t>9</w:t>
+      </w:r>
+      <w:r>
+        <w:rPr>
+          <w:rFonts w:cs="Times New Roman"/>
+        </w:rPr>
+        <w:t>)</w:t>
+      </w:r>
+      <w:r>
+        <w:rPr>
+          <w:rFonts w:cs="Times New Roman"/>
+        </w:rPr>
+        <w:t xml:space="preserve"> </w:t>
       </w:r>
       <w:r>
         <w:rPr>
@@ -4730,21 +4424,7 @@
         <w:rPr>
           <w:rFonts w:cs="Times New Roman"/>
         </w:rPr>
-        <w:t xml:space="preserve"> executes SHM. The </w:t>
-      </w:r>
-      <w:proofErr w:type="gramStart"/>
-      <w:r>
-        <w:rPr>
-          <w:rFonts w:cs="Times New Roman"/>
-        </w:rPr>
-        <w:t>time period</w:t>
-      </w:r>
-      <w:proofErr w:type="gramEnd"/>
-      <w:r>
-        <w:rPr>
-          <w:rFonts w:cs="Times New Roman"/>
-        </w:rPr>
-        <w:t xml:space="preserve"> of oscillation of charge </w:t>
+        <w:t xml:space="preserve"> executes SHM. The time period of oscillation of charge </w:t>
       </w:r>
       <m:oMath>
         <m:sSub>
@@ -5419,7 +5099,7 @@
         <w:rPr>
           <w:rFonts w:cs="Times New Roman"/>
         </w:rPr>
-        <w:t>[solution]</w:t>
+        <w:t>Answer: A</w:t>
       </w:r>
     </w:p>
     <w:p>
@@ -5439,7 +5119,7 @@
         <w:rPr>
           <w:rFonts w:cs="Times New Roman"/>
         </w:rPr>
-        <w:t>Option A</w:t>
+        <w:t>Explanation:</w:t>
       </w:r>
     </w:p>
     <w:p>
@@ -5459,21 +5139,7 @@
         <w:rPr>
           <w:rFonts w:cs="Times New Roman"/>
         </w:rPr>
-        <w:t>[</w:t>
-      </w:r>
-      <w:proofErr w:type="spellStart"/>
-      <w:r>
-        <w:rPr>
-          <w:rFonts w:cs="Times New Roman"/>
-        </w:rPr>
-        <w:t>Question_end</w:t>
-      </w:r>
-      <w:proofErr w:type="spellEnd"/>
-      <w:r>
-        <w:rPr>
-          <w:rFonts w:cs="Times New Roman"/>
-        </w:rPr>
-        <w:t>]</w:t>
+        <w:t>Option A is correct answer</w:t>
       </w:r>
     </w:p>
     <w:p>
@@ -5497,40 +5163,6 @@
           <w:tab w:val="left" w:pos="1134"/>
           <w:tab w:val="left" w:pos="2694"/>
         </w:tabs>
-        <w:spacing w:before="0" w:after="0"/>
-        <w:ind w:left="709" w:hanging="709"/>
-        <w:rPr>
-          <w:rFonts w:cs="Times New Roman"/>
-        </w:rPr>
-      </w:pPr>
-      <w:r>
-        <w:rPr>
-          <w:rFonts w:cs="Times New Roman"/>
-        </w:rPr>
-        <w:t>[</w:t>
-      </w:r>
-      <w:proofErr w:type="spellStart"/>
-      <w:r>
-        <w:rPr>
-          <w:rFonts w:cs="Times New Roman"/>
-        </w:rPr>
-        <w:t>Question_start</w:t>
-      </w:r>
-      <w:proofErr w:type="spellEnd"/>
-      <w:r>
-        <w:rPr>
-          <w:rFonts w:cs="Times New Roman"/>
-        </w:rPr>
-        <w:t>]</w:t>
-      </w:r>
-    </w:p>
-    <w:p>
-      <w:pPr>
-        <w:tabs>
-          <w:tab w:val="left" w:pos="709"/>
-          <w:tab w:val="left" w:pos="1134"/>
-          <w:tab w:val="left" w:pos="2694"/>
-        </w:tabs>
         <w:spacing w:after="0"/>
         <w:ind w:left="709" w:hanging="709"/>
         <w:rPr>
@@ -5541,7 +5173,25 @@
         <w:rPr>
           <w:rFonts w:cs="Times New Roman"/>
         </w:rPr>
-        <w:t xml:space="preserve">10. </w:t>
+        <w:t>Q</w:t>
+      </w:r>
+      <w:r>
+        <w:rPr>
+          <w:rFonts w:cs="Times New Roman"/>
+        </w:rPr>
+        <w:t>10</w:t>
+      </w:r>
+      <w:r>
+        <w:rPr>
+          <w:rFonts w:cs="Times New Roman"/>
+        </w:rPr>
+        <w:t>)</w:t>
+      </w:r>
+      <w:r>
+        <w:rPr>
+          <w:rFonts w:cs="Times New Roman"/>
+        </w:rPr>
+        <w:t xml:space="preserve"> </w:t>
       </w:r>
       <w:r>
         <w:rPr>
@@ -5553,21 +5203,7 @@
         <w:rPr>
           <w:rFonts w:cs="Times New Roman"/>
         </w:rPr>
-        <w:t xml:space="preserve">A </w:t>
-      </w:r>
-      <w:proofErr w:type="spellStart"/>
-      <w:r>
-        <w:rPr>
-          <w:rFonts w:cs="Times New Roman"/>
-        </w:rPr>
-        <w:t>darge</w:t>
-      </w:r>
-      <w:proofErr w:type="spellEnd"/>
-      <w:r>
-        <w:rPr>
-          <w:rFonts w:cs="Times New Roman"/>
-        </w:rPr>
-        <w:t xml:space="preserve"> of </w:t>
+        <w:t xml:space="preserve">A darge of </w:t>
       </w:r>
       <m:oMath>
         <m:r>
@@ -5913,7 +5549,7 @@
         <w:rPr>
           <w:rFonts w:cs="Times New Roman"/>
         </w:rPr>
-        <w:t>[solution]</w:t>
+        <w:t>Answer: A</w:t>
       </w:r>
     </w:p>
     <w:p>
@@ -5933,7 +5569,7 @@
         <w:rPr>
           <w:rFonts w:cs="Times New Roman"/>
         </w:rPr>
-        <w:t>Option A</w:t>
+        <w:t>Explanation:</w:t>
       </w:r>
     </w:p>
     <w:p>
@@ -5953,21 +5589,7 @@
         <w:rPr>
           <w:rFonts w:cs="Times New Roman"/>
         </w:rPr>
-        <w:t>[</w:t>
-      </w:r>
-      <w:proofErr w:type="spellStart"/>
-      <w:r>
-        <w:rPr>
-          <w:rFonts w:cs="Times New Roman"/>
-        </w:rPr>
-        <w:t>Question_end</w:t>
-      </w:r>
-      <w:proofErr w:type="spellEnd"/>
-      <w:r>
-        <w:rPr>
-          <w:rFonts w:cs="Times New Roman"/>
-        </w:rPr>
-        <w:t>]</w:t>
+        <w:t>Option A is correct answer</w:t>
       </w:r>
     </w:p>
     <w:p>
@@ -5991,40 +5613,6 @@
           <w:tab w:val="left" w:pos="1134"/>
           <w:tab w:val="left" w:pos="2694"/>
         </w:tabs>
-        <w:spacing w:before="0" w:after="0"/>
-        <w:ind w:left="709" w:hanging="709"/>
-        <w:rPr>
-          <w:rFonts w:cs="Times New Roman"/>
-        </w:rPr>
-      </w:pPr>
-      <w:r>
-        <w:rPr>
-          <w:rFonts w:cs="Times New Roman"/>
-        </w:rPr>
-        <w:t>[</w:t>
-      </w:r>
-      <w:proofErr w:type="spellStart"/>
-      <w:r>
-        <w:rPr>
-          <w:rFonts w:cs="Times New Roman"/>
-        </w:rPr>
-        <w:t>Question_start</w:t>
-      </w:r>
-      <w:proofErr w:type="spellEnd"/>
-      <w:r>
-        <w:rPr>
-          <w:rFonts w:cs="Times New Roman"/>
-        </w:rPr>
-        <w:t>]</w:t>
-      </w:r>
-    </w:p>
-    <w:p>
-      <w:pPr>
-        <w:tabs>
-          <w:tab w:val="left" w:pos="709"/>
-          <w:tab w:val="left" w:pos="1134"/>
-          <w:tab w:val="left" w:pos="2694"/>
-        </w:tabs>
         <w:spacing w:after="0"/>
         <w:ind w:left="709" w:hanging="709"/>
         <w:rPr>
@@ -6035,13 +5623,25 @@
         <w:rPr>
           <w:rFonts w:cs="Times New Roman"/>
         </w:rPr>
+        <w:t>Q</w:t>
+      </w:r>
+      <w:r>
+        <w:rPr>
+          <w:rFonts w:cs="Times New Roman"/>
+        </w:rPr>
         <w:t>11</w:t>
       </w:r>
       <w:r>
         <w:rPr>
           <w:rFonts w:cs="Times New Roman"/>
         </w:rPr>
-        <w:t xml:space="preserve">. </w:t>
+        <w:t>)</w:t>
+      </w:r>
+      <w:r>
+        <w:rPr>
+          <w:rFonts w:cs="Times New Roman"/>
+        </w:rPr>
+        <w:t xml:space="preserve"> </w:t>
       </w:r>
       <w:r>
         <w:rPr>
@@ -6123,21 +5723,7 @@
         <w:rPr>
           <w:rFonts w:cs="Times New Roman"/>
         </w:rPr>
-        <w:t xml:space="preserve"> at which charge a will experience the </w:t>
-      </w:r>
-      <w:proofErr w:type="spellStart"/>
-      <w:r>
-        <w:rPr>
-          <w:rFonts w:cs="Times New Roman"/>
-        </w:rPr>
-        <w:t>muximum</w:t>
-      </w:r>
-      <w:proofErr w:type="spellEnd"/>
-      <w:r>
-        <w:rPr>
-          <w:rFonts w:cs="Times New Roman"/>
-        </w:rPr>
-        <w:t xml:space="preserve"> Coulomb's force is</w:t>
+        <w:t xml:space="preserve"> at which charge a will experience the muximum Coulomb's force is</w:t>
       </w:r>
     </w:p>
     <w:p>
@@ -6423,8 +6009,7 @@
         <w:rPr>
           <w:rFonts w:cs="Times New Roman"/>
         </w:rPr>
-        <w:lastRenderedPageBreak/>
-        <w:t>[solution]</w:t>
+        <w:t>Answer: A</w:t>
       </w:r>
     </w:p>
     <w:p>
@@ -6444,7 +6029,7 @@
         <w:rPr>
           <w:rFonts w:cs="Times New Roman"/>
         </w:rPr>
-        <w:t>Option A</w:t>
+        <w:t>Explanation:</w:t>
       </w:r>
     </w:p>
     <w:p>
@@ -6464,21 +6049,7 @@
         <w:rPr>
           <w:rFonts w:cs="Times New Roman"/>
         </w:rPr>
-        <w:t>[</w:t>
-      </w:r>
-      <w:proofErr w:type="spellStart"/>
-      <w:r>
-        <w:rPr>
-          <w:rFonts w:cs="Times New Roman"/>
-        </w:rPr>
-        <w:t>Question_end</w:t>
-      </w:r>
-      <w:proofErr w:type="spellEnd"/>
-      <w:r>
-        <w:rPr>
-          <w:rFonts w:cs="Times New Roman"/>
-        </w:rPr>
-        <w:t>]</w:t>
+        <w:t>Option A is correct answer</w:t>
       </w:r>
     </w:p>
     <w:p>
@@ -6502,40 +6073,6 @@
           <w:tab w:val="left" w:pos="1134"/>
           <w:tab w:val="left" w:pos="2694"/>
         </w:tabs>
-        <w:spacing w:before="0" w:after="0"/>
-        <w:ind w:left="709" w:hanging="709"/>
-        <w:rPr>
-          <w:rFonts w:cs="Times New Roman"/>
-        </w:rPr>
-      </w:pPr>
-      <w:r>
-        <w:rPr>
-          <w:rFonts w:cs="Times New Roman"/>
-        </w:rPr>
-        <w:t>[</w:t>
-      </w:r>
-      <w:proofErr w:type="spellStart"/>
-      <w:r>
-        <w:rPr>
-          <w:rFonts w:cs="Times New Roman"/>
-        </w:rPr>
-        <w:t>Question_start</w:t>
-      </w:r>
-      <w:proofErr w:type="spellEnd"/>
-      <w:r>
-        <w:rPr>
-          <w:rFonts w:cs="Times New Roman"/>
-        </w:rPr>
-        <w:t>]</w:t>
-      </w:r>
-    </w:p>
-    <w:p>
-      <w:pPr>
-        <w:tabs>
-          <w:tab w:val="left" w:pos="709"/>
-          <w:tab w:val="left" w:pos="1134"/>
-          <w:tab w:val="left" w:pos="2694"/>
-        </w:tabs>
         <w:spacing w:after="0"/>
         <w:ind w:left="709" w:hanging="709"/>
         <w:rPr>
@@ -6546,7 +6083,25 @@
         <w:rPr>
           <w:rFonts w:cs="Times New Roman"/>
         </w:rPr>
-        <w:t xml:space="preserve">12. </w:t>
+        <w:t>Q</w:t>
+      </w:r>
+      <w:r>
+        <w:rPr>
+          <w:rFonts w:cs="Times New Roman"/>
+        </w:rPr>
+        <w:t>12</w:t>
+      </w:r>
+      <w:r>
+        <w:rPr>
+          <w:rFonts w:cs="Times New Roman"/>
+        </w:rPr>
+        <w:t>)</w:t>
+      </w:r>
+      <w:r>
+        <w:rPr>
+          <w:rFonts w:cs="Times New Roman"/>
+        </w:rPr>
+        <w:t xml:space="preserve"> </w:t>
       </w:r>
       <w:r>
         <w:rPr>
@@ -6648,6 +6203,7 @@
         <w:rPr>
           <w:rFonts w:cs="Times New Roman"/>
         </w:rPr>
+        <w:lastRenderedPageBreak/>
         <w:t>[June 27, 2022 (11)]</w:t>
       </w:r>
     </w:p>
@@ -6808,7 +6364,7 @@
         <w:rPr>
           <w:rFonts w:cs="Times New Roman"/>
         </w:rPr>
-        <w:t>[solution]</w:t>
+        <w:t>Answer: A</w:t>
       </w:r>
     </w:p>
     <w:p>
@@ -6828,7 +6384,7 @@
         <w:rPr>
           <w:rFonts w:cs="Times New Roman"/>
         </w:rPr>
-        <w:t>Option A</w:t>
+        <w:t>Explanation:</w:t>
       </w:r>
     </w:p>
     <w:p>
@@ -6848,21 +6404,7 @@
         <w:rPr>
           <w:rFonts w:cs="Times New Roman"/>
         </w:rPr>
-        <w:t>[</w:t>
-      </w:r>
-      <w:proofErr w:type="spellStart"/>
-      <w:r>
-        <w:rPr>
-          <w:rFonts w:cs="Times New Roman"/>
-        </w:rPr>
-        <w:t>Question_end</w:t>
-      </w:r>
-      <w:proofErr w:type="spellEnd"/>
-      <w:r>
-        <w:rPr>
-          <w:rFonts w:cs="Times New Roman"/>
-        </w:rPr>
-        <w:t>]</w:t>
+        <w:t>Option A is correct answer</w:t>
       </w:r>
     </w:p>
     <w:p>
@@ -6886,40 +6428,6 @@
           <w:tab w:val="left" w:pos="1134"/>
           <w:tab w:val="left" w:pos="2694"/>
         </w:tabs>
-        <w:spacing w:before="0" w:after="0"/>
-        <w:ind w:left="709" w:hanging="709"/>
-        <w:rPr>
-          <w:rFonts w:cs="Times New Roman"/>
-        </w:rPr>
-      </w:pPr>
-      <w:r>
-        <w:rPr>
-          <w:rFonts w:cs="Times New Roman"/>
-        </w:rPr>
-        <w:t>[</w:t>
-      </w:r>
-      <w:proofErr w:type="spellStart"/>
-      <w:r>
-        <w:rPr>
-          <w:rFonts w:cs="Times New Roman"/>
-        </w:rPr>
-        <w:t>Question_start</w:t>
-      </w:r>
-      <w:proofErr w:type="spellEnd"/>
-      <w:r>
-        <w:rPr>
-          <w:rFonts w:cs="Times New Roman"/>
-        </w:rPr>
-        <w:t>]</w:t>
-      </w:r>
-    </w:p>
-    <w:p>
-      <w:pPr>
-        <w:tabs>
-          <w:tab w:val="left" w:pos="709"/>
-          <w:tab w:val="left" w:pos="1134"/>
-          <w:tab w:val="left" w:pos="2694"/>
-        </w:tabs>
         <w:spacing w:after="0"/>
         <w:ind w:left="709" w:hanging="709"/>
         <w:rPr>
@@ -6930,7 +6438,25 @@
         <w:rPr>
           <w:rFonts w:cs="Times New Roman"/>
         </w:rPr>
-        <w:t xml:space="preserve">13. </w:t>
+        <w:t>Q</w:t>
+      </w:r>
+      <w:r>
+        <w:rPr>
+          <w:rFonts w:cs="Times New Roman"/>
+        </w:rPr>
+        <w:t>13</w:t>
+      </w:r>
+      <w:r>
+        <w:rPr>
+          <w:rFonts w:cs="Times New Roman"/>
+        </w:rPr>
+        <w:t>)</w:t>
+      </w:r>
+      <w:r>
+        <w:rPr>
+          <w:rFonts w:cs="Times New Roman"/>
+        </w:rPr>
+        <w:t xml:space="preserve"> </w:t>
       </w:r>
       <w:r>
         <w:rPr>
@@ -6942,35 +6468,7 @@
         <w:rPr>
           <w:rFonts w:cs="Times New Roman"/>
         </w:rPr>
-        <w:t xml:space="preserve">Sixty four </w:t>
-      </w:r>
-      <w:proofErr w:type="gramStart"/>
-      <w:r>
-        <w:rPr>
-          <w:rFonts w:cs="Times New Roman"/>
-        </w:rPr>
-        <w:t>conducting</w:t>
-      </w:r>
-      <w:proofErr w:type="gramEnd"/>
-      <w:r>
-        <w:rPr>
-          <w:rFonts w:cs="Times New Roman"/>
-        </w:rPr>
-        <w:t xml:space="preserve"> drops </w:t>
-      </w:r>
-      <w:proofErr w:type="spellStart"/>
-      <w:r>
-        <w:rPr>
-          <w:rFonts w:cs="Times New Roman"/>
-        </w:rPr>
-        <w:t>sach</w:t>
-      </w:r>
-      <w:proofErr w:type="spellEnd"/>
-      <w:r>
-        <w:rPr>
-          <w:rFonts w:cs="Times New Roman"/>
-        </w:rPr>
-        <w:t xml:space="preserve"> of radius 0.02 m and each carrying a charge of </w:t>
+        <w:t xml:space="preserve">Sixty four conducting drops sach of radius 0.02 m and each carrying a charge of </w:t>
       </w:r>
       <m:oMath>
         <m:r>
@@ -7151,7 +6649,7 @@
         <w:rPr>
           <w:rFonts w:cs="Times New Roman"/>
         </w:rPr>
-        <w:t>[solution]</w:t>
+        <w:t>Answer: A</w:t>
       </w:r>
     </w:p>
     <w:p>
@@ -7171,7 +6669,7 @@
         <w:rPr>
           <w:rFonts w:cs="Times New Roman"/>
         </w:rPr>
-        <w:t>Option A</w:t>
+        <w:t>Explanation:</w:t>
       </w:r>
     </w:p>
     <w:p>
@@ -7191,21 +6689,7 @@
         <w:rPr>
           <w:rFonts w:cs="Times New Roman"/>
         </w:rPr>
-        <w:t>[</w:t>
-      </w:r>
-      <w:proofErr w:type="spellStart"/>
-      <w:r>
-        <w:rPr>
-          <w:rFonts w:cs="Times New Roman"/>
-        </w:rPr>
-        <w:t>Question_end</w:t>
-      </w:r>
-      <w:proofErr w:type="spellEnd"/>
-      <w:r>
-        <w:rPr>
-          <w:rFonts w:cs="Times New Roman"/>
-        </w:rPr>
-        <w:t>]</w:t>
+        <w:t>Option A is correct answer</w:t>
       </w:r>
     </w:p>
     <w:p>
@@ -7229,40 +6713,6 @@
           <w:tab w:val="left" w:pos="1134"/>
           <w:tab w:val="left" w:pos="2694"/>
         </w:tabs>
-        <w:spacing w:before="0" w:after="0"/>
-        <w:ind w:left="709" w:hanging="709"/>
-        <w:rPr>
-          <w:rFonts w:cs="Times New Roman"/>
-        </w:rPr>
-      </w:pPr>
-      <w:r>
-        <w:rPr>
-          <w:rFonts w:cs="Times New Roman"/>
-        </w:rPr>
-        <w:t>[</w:t>
-      </w:r>
-      <w:proofErr w:type="spellStart"/>
-      <w:r>
-        <w:rPr>
-          <w:rFonts w:cs="Times New Roman"/>
-        </w:rPr>
-        <w:t>Question_start</w:t>
-      </w:r>
-      <w:proofErr w:type="spellEnd"/>
-      <w:r>
-        <w:rPr>
-          <w:rFonts w:cs="Times New Roman"/>
-        </w:rPr>
-        <w:t>]</w:t>
-      </w:r>
-    </w:p>
-    <w:p>
-      <w:pPr>
-        <w:tabs>
-          <w:tab w:val="left" w:pos="709"/>
-          <w:tab w:val="left" w:pos="1134"/>
-          <w:tab w:val="left" w:pos="2694"/>
-        </w:tabs>
         <w:spacing w:after="0"/>
         <w:ind w:left="709" w:hanging="709"/>
         <w:rPr>
@@ -7273,7 +6723,25 @@
         <w:rPr>
           <w:rFonts w:cs="Times New Roman"/>
         </w:rPr>
-        <w:t xml:space="preserve">14. </w:t>
+        <w:t>Q</w:t>
+      </w:r>
+      <w:r>
+        <w:rPr>
+          <w:rFonts w:cs="Times New Roman"/>
+        </w:rPr>
+        <w:t>14</w:t>
+      </w:r>
+      <w:r>
+        <w:rPr>
+          <w:rFonts w:cs="Times New Roman"/>
+        </w:rPr>
+        <w:t>)</w:t>
+      </w:r>
+      <w:r>
+        <w:rPr>
+          <w:rFonts w:cs="Times New Roman"/>
+        </w:rPr>
+        <w:t xml:space="preserve"> </w:t>
       </w:r>
       <w:r>
         <w:rPr>
@@ -7285,21 +6753,7 @@
         <w:rPr>
           <w:rFonts w:cs="Times New Roman"/>
         </w:rPr>
-        <w:t xml:space="preserve">Two identical charged particles each having a </w:t>
-      </w:r>
-      <w:proofErr w:type="gramStart"/>
-      <w:r>
-        <w:rPr>
-          <w:rFonts w:cs="Times New Roman"/>
-        </w:rPr>
-        <w:t>mass</w:t>
-      </w:r>
-      <w:proofErr w:type="gramEnd"/>
-      <w:r>
-        <w:rPr>
-          <w:rFonts w:cs="Times New Roman"/>
-        </w:rPr>
-        <w:t xml:space="preserve"> 10 g and charge </w:t>
+        <w:t xml:space="preserve">Two identical charged particles each having a mass 10 g and charge </w:t>
       </w:r>
       <m:oMath>
         <m:r>
@@ -7596,7 +7050,7 @@
         <w:rPr>
           <w:rFonts w:cs="Times New Roman"/>
         </w:rPr>
-        <w:t>[solution]</w:t>
+        <w:t>Answer: A</w:t>
       </w:r>
     </w:p>
     <w:p>
@@ -7616,7 +7070,7 @@
         <w:rPr>
           <w:rFonts w:cs="Times New Roman"/>
         </w:rPr>
-        <w:t>Option A</w:t>
+        <w:t>Explanation:</w:t>
       </w:r>
     </w:p>
     <w:p>
@@ -7636,21 +7090,7 @@
         <w:rPr>
           <w:rFonts w:cs="Times New Roman"/>
         </w:rPr>
-        <w:t>[</w:t>
-      </w:r>
-      <w:proofErr w:type="spellStart"/>
-      <w:r>
-        <w:rPr>
-          <w:rFonts w:cs="Times New Roman"/>
-        </w:rPr>
-        <w:t>Question_end</w:t>
-      </w:r>
-      <w:proofErr w:type="spellEnd"/>
-      <w:r>
-        <w:rPr>
-          <w:rFonts w:cs="Times New Roman"/>
-        </w:rPr>
-        <w:t>]</w:t>
+        <w:t>Option A is correct answer</w:t>
       </w:r>
     </w:p>
     <w:p>
@@ -7674,40 +7114,6 @@
           <w:tab w:val="left" w:pos="1134"/>
           <w:tab w:val="left" w:pos="2694"/>
         </w:tabs>
-        <w:spacing w:before="0" w:after="0"/>
-        <w:ind w:left="709" w:hanging="709"/>
-        <w:rPr>
-          <w:rFonts w:cs="Times New Roman"/>
-        </w:rPr>
-      </w:pPr>
-      <w:r>
-        <w:rPr>
-          <w:rFonts w:cs="Times New Roman"/>
-        </w:rPr>
-        <w:t>[</w:t>
-      </w:r>
-      <w:proofErr w:type="spellStart"/>
-      <w:r>
-        <w:rPr>
-          <w:rFonts w:cs="Times New Roman"/>
-        </w:rPr>
-        <w:t>Question_start</w:t>
-      </w:r>
-      <w:proofErr w:type="spellEnd"/>
-      <w:r>
-        <w:rPr>
-          <w:rFonts w:cs="Times New Roman"/>
-        </w:rPr>
-        <w:t>]</w:t>
-      </w:r>
-    </w:p>
-    <w:p>
-      <w:pPr>
-        <w:tabs>
-          <w:tab w:val="left" w:pos="709"/>
-          <w:tab w:val="left" w:pos="1134"/>
-          <w:tab w:val="left" w:pos="2694"/>
-        </w:tabs>
         <w:spacing w:after="0"/>
         <w:ind w:left="709" w:hanging="709"/>
         <w:rPr>
@@ -7718,13 +7124,31 @@
         <w:rPr>
           <w:rFonts w:cs="Times New Roman"/>
         </w:rPr>
+        <w:t>Q</w:t>
+      </w:r>
+      <w:r>
+        <w:rPr>
+          <w:rFonts w:cs="Times New Roman"/>
+        </w:rPr>
         <w:t>1</w:t>
       </w:r>
       <w:r>
         <w:rPr>
           <w:rFonts w:cs="Times New Roman"/>
         </w:rPr>
-        <w:t xml:space="preserve">5. </w:t>
+        <w:t>5</w:t>
+      </w:r>
+      <w:r>
+        <w:rPr>
+          <w:rFonts w:cs="Times New Roman"/>
+        </w:rPr>
+        <w:t>)</w:t>
+      </w:r>
+      <w:r>
+        <w:rPr>
+          <w:rFonts w:cs="Times New Roman"/>
+        </w:rPr>
+        <w:t xml:space="preserve"> </w:t>
       </w:r>
       <w:r>
         <w:rPr>
@@ -7876,7 +7300,6 @@
         <w:rPr>
           <w:rFonts w:cs="Times New Roman"/>
         </w:rPr>
-        <w:lastRenderedPageBreak/>
         <w:t>[</w:t>
       </w:r>
       <w:r>
@@ -8115,7 +7538,7 @@
         <w:rPr>
           <w:rFonts w:cs="Times New Roman"/>
         </w:rPr>
-        <w:t>[solution]</w:t>
+        <w:t>Answer: A</w:t>
       </w:r>
     </w:p>
     <w:p>
@@ -8135,7 +7558,7 @@
         <w:rPr>
           <w:rFonts w:cs="Times New Roman"/>
         </w:rPr>
-        <w:t>Option A</w:t>
+        <w:t>Explanation:</w:t>
       </w:r>
     </w:p>
     <w:p>
@@ -8155,21 +7578,7 @@
         <w:rPr>
           <w:rFonts w:cs="Times New Roman"/>
         </w:rPr>
-        <w:t>[</w:t>
-      </w:r>
-      <w:proofErr w:type="spellStart"/>
-      <w:r>
-        <w:rPr>
-          <w:rFonts w:cs="Times New Roman"/>
-        </w:rPr>
-        <w:t>Question_end</w:t>
-      </w:r>
-      <w:proofErr w:type="spellEnd"/>
-      <w:r>
-        <w:rPr>
-          <w:rFonts w:cs="Times New Roman"/>
-        </w:rPr>
-        <w:t>]</w:t>
+        <w:t>Option A is correct answer</w:t>
       </w:r>
     </w:p>
     <w:p>
@@ -8193,40 +7602,6 @@
           <w:tab w:val="left" w:pos="1134"/>
           <w:tab w:val="left" w:pos="2694"/>
         </w:tabs>
-        <w:spacing w:before="0" w:after="0"/>
-        <w:ind w:left="709" w:hanging="709"/>
-        <w:rPr>
-          <w:rFonts w:cs="Times New Roman"/>
-        </w:rPr>
-      </w:pPr>
-      <w:r>
-        <w:rPr>
-          <w:rFonts w:cs="Times New Roman"/>
-        </w:rPr>
-        <w:t>[</w:t>
-      </w:r>
-      <w:proofErr w:type="spellStart"/>
-      <w:r>
-        <w:rPr>
-          <w:rFonts w:cs="Times New Roman"/>
-        </w:rPr>
-        <w:t>Question_start</w:t>
-      </w:r>
-      <w:proofErr w:type="spellEnd"/>
-      <w:r>
-        <w:rPr>
-          <w:rFonts w:cs="Times New Roman"/>
-        </w:rPr>
-        <w:t>]</w:t>
-      </w:r>
-    </w:p>
-    <w:p>
-      <w:pPr>
-        <w:tabs>
-          <w:tab w:val="left" w:pos="709"/>
-          <w:tab w:val="left" w:pos="1134"/>
-          <w:tab w:val="left" w:pos="2694"/>
-        </w:tabs>
         <w:spacing w:after="0"/>
         <w:ind w:left="709" w:hanging="709"/>
         <w:rPr>
@@ -8237,7 +7612,25 @@
         <w:rPr>
           <w:rFonts w:cs="Times New Roman"/>
         </w:rPr>
-        <w:t xml:space="preserve">16. </w:t>
+        <w:t>Q</w:t>
+      </w:r>
+      <w:r>
+        <w:rPr>
+          <w:rFonts w:cs="Times New Roman"/>
+        </w:rPr>
+        <w:t>16</w:t>
+      </w:r>
+      <w:r>
+        <w:rPr>
+          <w:rFonts w:cs="Times New Roman"/>
+        </w:rPr>
+        <w:t>)</w:t>
+      </w:r>
+      <w:r>
+        <w:rPr>
+          <w:rFonts w:cs="Times New Roman"/>
+        </w:rPr>
+        <w:t xml:space="preserve"> </w:t>
       </w:r>
       <w:r>
         <w:rPr>
@@ -8379,6 +7772,7 @@
         <w:rPr>
           <w:rFonts w:cs="Times New Roman"/>
         </w:rPr>
+        <w:lastRenderedPageBreak/>
         <w:tab/>
       </w:r>
       <w:r>
@@ -9171,7 +8565,7 @@
         <w:rPr>
           <w:rFonts w:cs="Times New Roman"/>
         </w:rPr>
-        <w:t>[solution]</w:t>
+        <w:t>Answer: A</w:t>
       </w:r>
     </w:p>
     <w:p>
@@ -9191,7 +8585,7 @@
         <w:rPr>
           <w:rFonts w:cs="Times New Roman"/>
         </w:rPr>
-        <w:t>Option A</w:t>
+        <w:t>Explanation:</w:t>
       </w:r>
     </w:p>
     <w:p>
@@ -9211,21 +8605,7 @@
         <w:rPr>
           <w:rFonts w:cs="Times New Roman"/>
         </w:rPr>
-        <w:t>[</w:t>
-      </w:r>
-      <w:proofErr w:type="spellStart"/>
-      <w:r>
-        <w:rPr>
-          <w:rFonts w:cs="Times New Roman"/>
-        </w:rPr>
-        <w:t>Question_end</w:t>
-      </w:r>
-      <w:proofErr w:type="spellEnd"/>
-      <w:r>
-        <w:rPr>
-          <w:rFonts w:cs="Times New Roman"/>
-        </w:rPr>
-        <w:t>]</w:t>
+        <w:t>Option A is correct answer</w:t>
       </w:r>
     </w:p>
     <w:p>
@@ -9249,37 +8629,6 @@
           <w:tab w:val="left" w:pos="1134"/>
           <w:tab w:val="left" w:pos="2694"/>
         </w:tabs>
-        <w:spacing w:before="0" w:after="0"/>
-        <w:ind w:left="709" w:hanging="709"/>
-      </w:pPr>
-      <w:r>
-        <w:rPr>
-          <w:rFonts w:cs="Times New Roman"/>
-        </w:rPr>
-        <w:t>[</w:t>
-      </w:r>
-      <w:proofErr w:type="spellStart"/>
-      <w:r>
-        <w:rPr>
-          <w:rFonts w:cs="Times New Roman"/>
-        </w:rPr>
-        <w:t>Question_start</w:t>
-      </w:r>
-      <w:proofErr w:type="spellEnd"/>
-      <w:r>
-        <w:rPr>
-          <w:rFonts w:cs="Times New Roman"/>
-        </w:rPr>
-        <w:t>]</w:t>
-      </w:r>
-    </w:p>
-    <w:p>
-      <w:pPr>
-        <w:tabs>
-          <w:tab w:val="left" w:pos="709"/>
-          <w:tab w:val="left" w:pos="1134"/>
-          <w:tab w:val="left" w:pos="2694"/>
-        </w:tabs>
         <w:spacing w:after="0"/>
         <w:ind w:left="709" w:hanging="709"/>
         <w:rPr>
@@ -9290,7 +8639,25 @@
         <w:rPr>
           <w:rFonts w:cs="Times New Roman"/>
         </w:rPr>
-        <w:t xml:space="preserve">17. </w:t>
+        <w:t>Q</w:t>
+      </w:r>
+      <w:r>
+        <w:rPr>
+          <w:rFonts w:cs="Times New Roman"/>
+        </w:rPr>
+        <w:t>17</w:t>
+      </w:r>
+      <w:r>
+        <w:rPr>
+          <w:rFonts w:cs="Times New Roman"/>
+        </w:rPr>
+        <w:t>)</w:t>
+      </w:r>
+      <w:r>
+        <w:rPr>
+          <w:rFonts w:cs="Times New Roman"/>
+        </w:rPr>
+        <w:t xml:space="preserve"> </w:t>
       </w:r>
       <w:r>
         <w:rPr>
@@ -9330,21 +8697,7 @@
         <w:rPr>
           <w:rFonts w:cs="Times New Roman"/>
         </w:rPr>
-        <w:t xml:space="preserve"> mid if, </w:t>
-      </w:r>
-      <w:proofErr w:type="gramStart"/>
-      <w:r>
-        <w:rPr>
-          <w:rFonts w:cs="Times New Roman"/>
-        </w:rPr>
-        <w:t>How</w:t>
-      </w:r>
-      <w:proofErr w:type="gramEnd"/>
-      <w:r>
-        <w:rPr>
-          <w:rFonts w:cs="Times New Roman"/>
-        </w:rPr>
-        <w:t xml:space="preserve"> should the charges </w:t>
+        <w:t xml:space="preserve"> mid if, How should the charges </w:t>
       </w:r>
       <m:oMath>
         <m:r>
@@ -9386,49 +8739,43 @@
         <w:rPr>
           <w:rFonts w:cs="Times New Roman"/>
         </w:rPr>
-        <w:t xml:space="preserve"> - q) placed at a certain distance </w:t>
-      </w:r>
-      <w:proofErr w:type="spellStart"/>
-      <w:r>
-        <w:rPr>
-          <w:rFonts w:cs="Times New Roman"/>
-        </w:rPr>
-        <w:t>apari</w:t>
-      </w:r>
-      <w:proofErr w:type="spellEnd"/>
+        <w:t xml:space="preserve"> - q) placed at a certain distance a</w:t>
+      </w:r>
       <w:r>
         <w:rPr>
           <w:rFonts w:cs="Times New Roman"/>
         </w:rPr>
         <w:t xml:space="preserve"> </w:t>
       </w:r>
-      <w:proofErr w:type="spellStart"/>
-      <w:r>
-        <w:rPr>
-          <w:rFonts w:cs="Times New Roman"/>
-        </w:rPr>
-        <w:t>experiencesting</w:t>
-      </w:r>
-      <w:proofErr w:type="spellEnd"/>
-      <w:r>
-        <w:rPr>
-          <w:rFonts w:cs="Times New Roman"/>
-        </w:rPr>
-        <w:t xml:space="preserve"> electrostatic </w:t>
-      </w:r>
-      <w:proofErr w:type="spellStart"/>
-      <w:r>
-        <w:rPr>
-          <w:rFonts w:cs="Times New Roman"/>
-        </w:rPr>
-        <w:t>tepulsion</w:t>
-      </w:r>
-      <w:proofErr w:type="spellEnd"/>
-      <w:r>
-        <w:rPr>
-          <w:rFonts w:cs="Times New Roman"/>
-        </w:rPr>
-        <w:t>?</w:t>
+      <w:r>
+        <w:rPr>
+          <w:rFonts w:cs="Times New Roman"/>
+        </w:rPr>
+        <w:t>par</w:t>
+      </w:r>
+      <w:r>
+        <w:rPr>
+          <w:rFonts w:cs="Times New Roman"/>
+        </w:rPr>
+        <w:t>t</w:t>
+      </w:r>
+      <w:r>
+        <w:rPr>
+          <w:rFonts w:cs="Times New Roman"/>
+        </w:rPr>
+        <w:t xml:space="preserve"> experiencing electrostatic </w:t>
+      </w:r>
+      <w:r>
+        <w:rPr>
+          <w:rFonts w:cs="Times New Roman"/>
+        </w:rPr>
+        <w:t>r</w:t>
+      </w:r>
+      <w:r>
+        <w:rPr>
+          <w:rFonts w:cs="Times New Roman"/>
+        </w:rPr>
+        <w:t>epulsion?</w:t>
       </w:r>
     </w:p>
     <w:p>
@@ -9626,7 +8973,7 @@
         <w:rPr>
           <w:rFonts w:cs="Times New Roman"/>
         </w:rPr>
-        <w:t>[solution]</w:t>
+        <w:t>Answer: A</w:t>
       </w:r>
     </w:p>
     <w:p>
@@ -9646,7 +8993,7 @@
         <w:rPr>
           <w:rFonts w:cs="Times New Roman"/>
         </w:rPr>
-        <w:t>Option A</w:t>
+        <w:t>Explanation:</w:t>
       </w:r>
     </w:p>
     <w:p>
@@ -9666,21 +9013,7 @@
         <w:rPr>
           <w:rFonts w:cs="Times New Roman"/>
         </w:rPr>
-        <w:t>[</w:t>
-      </w:r>
-      <w:proofErr w:type="spellStart"/>
-      <w:r>
-        <w:rPr>
-          <w:rFonts w:cs="Times New Roman"/>
-        </w:rPr>
-        <w:t>Question_end</w:t>
-      </w:r>
-      <w:proofErr w:type="spellEnd"/>
-      <w:r>
-        <w:rPr>
-          <w:rFonts w:cs="Times New Roman"/>
-        </w:rPr>
-        <w:t>]</w:t>
+        <w:t>Option A is correct answer</w:t>
       </w:r>
     </w:p>
     <w:p>
@@ -9714,41 +9047,25 @@
         <w:rPr>
           <w:rFonts w:cs="Times New Roman"/>
         </w:rPr>
-        <w:t>[</w:t>
-      </w:r>
-      <w:proofErr w:type="spellStart"/>
-      <w:r>
-        <w:rPr>
-          <w:rFonts w:cs="Times New Roman"/>
-        </w:rPr>
-        <w:t>Question_start</w:t>
-      </w:r>
-      <w:proofErr w:type="spellEnd"/>
-      <w:r>
-        <w:rPr>
-          <w:rFonts w:cs="Times New Roman"/>
-        </w:rPr>
-        <w:t>]</w:t>
-      </w:r>
-    </w:p>
-    <w:p>
-      <w:pPr>
-        <w:tabs>
-          <w:tab w:val="left" w:pos="709"/>
-          <w:tab w:val="left" w:pos="1134"/>
-          <w:tab w:val="left" w:pos="2694"/>
-        </w:tabs>
-        <w:spacing w:after="0"/>
-        <w:ind w:left="709" w:hanging="709"/>
-        <w:rPr>
-          <w:rFonts w:cs="Times New Roman"/>
-        </w:rPr>
-      </w:pPr>
-      <w:r>
-        <w:rPr>
-          <w:rFonts w:cs="Times New Roman"/>
-        </w:rPr>
-        <w:t xml:space="preserve">18. </w:t>
+        <w:t>Q</w:t>
+      </w:r>
+      <w:r>
+        <w:rPr>
+          <w:rFonts w:cs="Times New Roman"/>
+        </w:rPr>
+        <w:t>18</w:t>
+      </w:r>
+      <w:r>
+        <w:rPr>
+          <w:rFonts w:cs="Times New Roman"/>
+        </w:rPr>
+        <w:t>)</w:t>
+      </w:r>
+      <w:r>
+        <w:rPr>
+          <w:rFonts w:cs="Times New Roman"/>
+        </w:rPr>
+        <w:t xml:space="preserve"> </w:t>
       </w:r>
       <w:r>
         <w:rPr>
@@ -9760,21 +9077,43 @@
         <w:rPr>
           <w:rFonts w:cs="Times New Roman"/>
         </w:rPr>
-        <w:t xml:space="preserve">Three </w:t>
-      </w:r>
-      <w:proofErr w:type="spellStart"/>
-      <w:r>
-        <w:rPr>
-          <w:rFonts w:cs="Times New Roman"/>
-        </w:rPr>
-        <w:t>charjes</w:t>
-      </w:r>
-      <w:proofErr w:type="spellEnd"/>
-      <w:r>
-        <w:rPr>
-          <w:rFonts w:cs="Times New Roman"/>
-        </w:rPr>
-        <w:t xml:space="preserve"> + Q.9. Oare placed respotively at (Ry) </w:t>
+        <w:t>Three char</w:t>
+      </w:r>
+      <w:r>
+        <w:rPr>
+          <w:rFonts w:cs="Times New Roman"/>
+        </w:rPr>
+        <w:t>g</w:t>
+      </w:r>
+      <w:r>
+        <w:rPr>
+          <w:rFonts w:cs="Times New Roman"/>
+        </w:rPr>
+        <w:t>es + Q.9. O</w:t>
+      </w:r>
+      <w:r>
+        <w:rPr>
+          <w:rFonts w:cs="Times New Roman"/>
+        </w:rPr>
+        <w:t xml:space="preserve"> </w:t>
+      </w:r>
+      <w:r>
+        <w:rPr>
+          <w:rFonts w:cs="Times New Roman"/>
+        </w:rPr>
+        <w:t xml:space="preserve">are placed </w:t>
+      </w:r>
+      <w:r>
+        <w:rPr>
+          <w:rFonts w:cs="Times New Roman"/>
+        </w:rPr>
+        <w:t>respectively</w:t>
+      </w:r>
+      <w:r>
+        <w:rPr>
+          <w:rFonts w:cs="Times New Roman"/>
+        </w:rPr>
+        <w:t xml:space="preserve"> at (Ry) </w:t>
       </w:r>
       <m:oMath>
         <m:r>
@@ -10033,7 +9372,7 @@
         <w:rPr>
           <w:rFonts w:cs="Times New Roman"/>
         </w:rPr>
-        <w:t>[solution]</w:t>
+        <w:t>Answer: A</w:t>
       </w:r>
     </w:p>
     <w:p>
@@ -10053,7 +9392,7 @@
         <w:rPr>
           <w:rFonts w:cs="Times New Roman"/>
         </w:rPr>
-        <w:t>Option A</w:t>
+        <w:t>Explanation:</w:t>
       </w:r>
     </w:p>
     <w:p>
@@ -10073,22 +9412,22 @@
         <w:rPr>
           <w:rFonts w:cs="Times New Roman"/>
         </w:rPr>
-        <w:t>[</w:t>
-      </w:r>
-      <w:proofErr w:type="spellStart"/>
-      <w:r>
-        <w:rPr>
-          <w:rFonts w:cs="Times New Roman"/>
-        </w:rPr>
-        <w:t>Question_end</w:t>
-      </w:r>
-      <w:proofErr w:type="spellEnd"/>
-      <w:r>
-        <w:rPr>
-          <w:rFonts w:cs="Times New Roman"/>
-        </w:rPr>
-        <w:t>]</w:t>
-      </w:r>
+        <w:t>Option A is correct answer</w:t>
+      </w:r>
+    </w:p>
+    <w:p>
+      <w:pPr>
+        <w:tabs>
+          <w:tab w:val="left" w:pos="709"/>
+          <w:tab w:val="left" w:pos="1134"/>
+          <w:tab w:val="left" w:pos="2694"/>
+        </w:tabs>
+        <w:spacing w:before="0" w:after="0"/>
+        <w:ind w:left="709" w:hanging="709"/>
+        <w:rPr>
+          <w:rFonts w:cs="Times New Roman"/>
+        </w:rPr>
+      </w:pPr>
     </w:p>
     <w:p>
       <w:pPr>
@@ -10103,60 +9442,29 @@
           <w:rFonts w:cs="Times New Roman"/>
         </w:rPr>
       </w:pPr>
-    </w:p>
-    <w:p>
-      <w:pPr>
-        <w:tabs>
-          <w:tab w:val="left" w:pos="709"/>
-          <w:tab w:val="left" w:pos="1134"/>
-          <w:tab w:val="left" w:pos="2694"/>
-        </w:tabs>
-        <w:spacing w:after="0"/>
-        <w:ind w:left="709" w:hanging="709"/>
-        <w:rPr>
-          <w:rFonts w:cs="Times New Roman"/>
-        </w:rPr>
-      </w:pPr>
-      <w:r>
-        <w:rPr>
-          <w:rFonts w:cs="Times New Roman"/>
-        </w:rPr>
-        <w:t>[</w:t>
-      </w:r>
-      <w:proofErr w:type="spellStart"/>
-      <w:r>
-        <w:rPr>
-          <w:rFonts w:cs="Times New Roman"/>
-        </w:rPr>
-        <w:t>Question_start</w:t>
-      </w:r>
-      <w:proofErr w:type="spellEnd"/>
-      <w:r>
-        <w:rPr>
-          <w:rFonts w:cs="Times New Roman"/>
-        </w:rPr>
-        <w:t>]</w:t>
-      </w:r>
-    </w:p>
-    <w:p>
-      <w:pPr>
-        <w:tabs>
-          <w:tab w:val="left" w:pos="709"/>
-          <w:tab w:val="left" w:pos="1134"/>
-          <w:tab w:val="left" w:pos="2694"/>
-        </w:tabs>
-        <w:spacing w:after="0"/>
-        <w:ind w:left="709" w:hanging="709"/>
-        <w:rPr>
-          <w:rFonts w:cs="Times New Roman"/>
-        </w:rPr>
-      </w:pPr>
-      <w:r>
-        <w:rPr>
-          <w:rFonts w:cs="Times New Roman"/>
-        </w:rPr>
-        <w:lastRenderedPageBreak/>
-        <w:t xml:space="preserve">19. </w:t>
+      <w:r>
+        <w:rPr>
+          <w:rFonts w:cs="Times New Roman"/>
+        </w:rPr>
+        <w:t>Q</w:t>
+      </w:r>
+      <w:r>
+        <w:rPr>
+          <w:rFonts w:cs="Times New Roman"/>
+        </w:rPr>
+        <w:t>19</w:t>
+      </w:r>
+      <w:r>
+        <w:rPr>
+          <w:rFonts w:cs="Times New Roman"/>
+        </w:rPr>
+        <w:t>)</w:t>
+      </w:r>
+      <w:r>
+        <w:rPr>
+          <w:rFonts w:cs="Times New Roman"/>
+        </w:rPr>
+        <w:t xml:space="preserve"> </w:t>
       </w:r>
       <w:r>
         <w:rPr>
@@ -10168,21 +9476,7 @@
         <w:rPr>
           <w:rFonts w:cs="Times New Roman"/>
         </w:rPr>
-        <w:t xml:space="preserve">Charge is distributed within a sphere of radius </w:t>
-      </w:r>
-      <w:proofErr w:type="gramStart"/>
-      <w:r>
-        <w:rPr>
-          <w:rFonts w:cs="Times New Roman"/>
-        </w:rPr>
-        <w:t>it</w:t>
-      </w:r>
-      <w:proofErr w:type="gramEnd"/>
-      <w:r>
-        <w:rPr>
-          <w:rFonts w:cs="Times New Roman"/>
-        </w:rPr>
-        <w:t xml:space="preserve"> which volume charge density </w:t>
+        <w:t xml:space="preserve">Charge is distributed within a sphere of radius it which volume charge density </w:t>
       </w:r>
       <m:oMath>
         <m:r>
@@ -10815,7 +10109,7 @@
         <w:rPr>
           <w:rFonts w:cs="Times New Roman"/>
         </w:rPr>
-        <w:t>[solution]</w:t>
+        <w:t>Answer: A</w:t>
       </w:r>
     </w:p>
     <w:p>
@@ -10835,7 +10129,7 @@
         <w:rPr>
           <w:rFonts w:cs="Times New Roman"/>
         </w:rPr>
-        <w:t>Option A</w:t>
+        <w:t>Explanation:</w:t>
       </w:r>
     </w:p>
     <w:p>
@@ -10855,21 +10149,7 @@
         <w:rPr>
           <w:rFonts w:cs="Times New Roman"/>
         </w:rPr>
-        <w:t>[</w:t>
-      </w:r>
-      <w:proofErr w:type="spellStart"/>
-      <w:r>
-        <w:rPr>
-          <w:rFonts w:cs="Times New Roman"/>
-        </w:rPr>
-        <w:t>Question_end</w:t>
-      </w:r>
-      <w:proofErr w:type="spellEnd"/>
-      <w:r>
-        <w:rPr>
-          <w:rFonts w:cs="Times New Roman"/>
-        </w:rPr>
-        <w:t>]</w:t>
+        <w:t>Option A is correct answer</w:t>
       </w:r>
     </w:p>
     <w:p>
@@ -10893,40 +10173,6 @@
           <w:tab w:val="left" w:pos="1134"/>
           <w:tab w:val="left" w:pos="2694"/>
         </w:tabs>
-        <w:spacing w:before="0" w:after="0"/>
-        <w:ind w:left="709" w:hanging="709"/>
-        <w:rPr>
-          <w:rFonts w:cs="Times New Roman"/>
-        </w:rPr>
-      </w:pPr>
-      <w:r>
-        <w:rPr>
-          <w:rFonts w:cs="Times New Roman"/>
-        </w:rPr>
-        <w:t>[</w:t>
-      </w:r>
-      <w:proofErr w:type="spellStart"/>
-      <w:r>
-        <w:rPr>
-          <w:rFonts w:cs="Times New Roman"/>
-        </w:rPr>
-        <w:t>Question_start</w:t>
-      </w:r>
-      <w:proofErr w:type="spellEnd"/>
-      <w:r>
-        <w:rPr>
-          <w:rFonts w:cs="Times New Roman"/>
-        </w:rPr>
-        <w:t>]</w:t>
-      </w:r>
-    </w:p>
-    <w:p>
-      <w:pPr>
-        <w:tabs>
-          <w:tab w:val="left" w:pos="709"/>
-          <w:tab w:val="left" w:pos="1134"/>
-          <w:tab w:val="left" w:pos="2694"/>
-        </w:tabs>
         <w:spacing w:after="0"/>
         <w:ind w:left="709" w:hanging="709"/>
         <w:rPr>
@@ -10937,7 +10183,25 @@
         <w:rPr>
           <w:rFonts w:cs="Times New Roman"/>
         </w:rPr>
-        <w:t xml:space="preserve">20. </w:t>
+        <w:t>Q</w:t>
+      </w:r>
+      <w:r>
+        <w:rPr>
+          <w:rFonts w:cs="Times New Roman"/>
+        </w:rPr>
+        <w:t>20</w:t>
+      </w:r>
+      <w:r>
+        <w:rPr>
+          <w:rFonts w:cs="Times New Roman"/>
+        </w:rPr>
+        <w:t>)</w:t>
+      </w:r>
+      <w:r>
+        <w:rPr>
+          <w:rFonts w:cs="Times New Roman"/>
+        </w:rPr>
+        <w:t xml:space="preserve"> </w:t>
       </w:r>
       <w:r>
         <w:rPr>
@@ -11110,6 +10374,7 @@
         <w:rPr>
           <w:rFonts w:cs="Times New Roman"/>
         </w:rPr>
+        <w:lastRenderedPageBreak/>
         <w:tab/>
       </w:r>
       <w:r>
@@ -11182,7 +10447,7 @@
         <w:rPr>
           <w:rFonts w:cs="Times New Roman"/>
         </w:rPr>
-        <w:t>[solution]</w:t>
+        <w:t>Answer: A</w:t>
       </w:r>
     </w:p>
     <w:p>
@@ -11202,7 +10467,7 @@
         <w:rPr>
           <w:rFonts w:cs="Times New Roman"/>
         </w:rPr>
-        <w:t>Option A</w:t>
+        <w:t>Explanation:</w:t>
       </w:r>
     </w:p>
     <w:p>
@@ -11222,21 +10487,7 @@
         <w:rPr>
           <w:rFonts w:cs="Times New Roman"/>
         </w:rPr>
-        <w:t>[</w:t>
-      </w:r>
-      <w:proofErr w:type="spellStart"/>
-      <w:r>
-        <w:rPr>
-          <w:rFonts w:cs="Times New Roman"/>
-        </w:rPr>
-        <w:t>Question_end</w:t>
-      </w:r>
-      <w:proofErr w:type="spellEnd"/>
-      <w:r>
-        <w:rPr>
-          <w:rFonts w:cs="Times New Roman"/>
-        </w:rPr>
-        <w:t>]</w:t>
+        <w:t>Option A is correct answer</w:t>
       </w:r>
     </w:p>
     <w:p>
@@ -11260,40 +10511,6 @@
           <w:tab w:val="left" w:pos="1134"/>
           <w:tab w:val="left" w:pos="2694"/>
         </w:tabs>
-        <w:spacing w:before="0" w:after="0"/>
-        <w:ind w:left="709" w:hanging="709"/>
-        <w:rPr>
-          <w:rFonts w:cs="Times New Roman"/>
-        </w:rPr>
-      </w:pPr>
-      <w:r>
-        <w:rPr>
-          <w:rFonts w:cs="Times New Roman"/>
-        </w:rPr>
-        <w:t>[</w:t>
-      </w:r>
-      <w:proofErr w:type="spellStart"/>
-      <w:r>
-        <w:rPr>
-          <w:rFonts w:cs="Times New Roman"/>
-        </w:rPr>
-        <w:t>Question_start</w:t>
-      </w:r>
-      <w:proofErr w:type="spellEnd"/>
-      <w:r>
-        <w:rPr>
-          <w:rFonts w:cs="Times New Roman"/>
-        </w:rPr>
-        <w:t>]</w:t>
-      </w:r>
-    </w:p>
-    <w:p>
-      <w:pPr>
-        <w:tabs>
-          <w:tab w:val="left" w:pos="709"/>
-          <w:tab w:val="left" w:pos="1134"/>
-          <w:tab w:val="left" w:pos="2694"/>
-        </w:tabs>
         <w:spacing w:after="0"/>
         <w:ind w:left="709" w:hanging="709"/>
         <w:rPr>
@@ -11304,7 +10521,25 @@
         <w:rPr>
           <w:rFonts w:cs="Times New Roman"/>
         </w:rPr>
-        <w:t xml:space="preserve">21. </w:t>
+        <w:t>Q</w:t>
+      </w:r>
+      <w:r>
+        <w:rPr>
+          <w:rFonts w:cs="Times New Roman"/>
+        </w:rPr>
+        <w:t>21</w:t>
+      </w:r>
+      <w:r>
+        <w:rPr>
+          <w:rFonts w:cs="Times New Roman"/>
+        </w:rPr>
+        <w:t>)</w:t>
+      </w:r>
+      <w:r>
+        <w:rPr>
+          <w:rFonts w:cs="Times New Roman"/>
+        </w:rPr>
+        <w:t xml:space="preserve"> </w:t>
       </w:r>
       <w:r>
         <w:rPr>
@@ -11362,21 +10597,7 @@
         <w:rPr>
           <w:rFonts w:cs="Times New Roman"/>
         </w:rPr>
-        <w:t xml:space="preserve"> inside the cavity of a spherical shell. The charges are kept near the surface of the cavity on opposite sides of the </w:t>
-      </w:r>
-      <w:proofErr w:type="spellStart"/>
-      <w:r>
-        <w:rPr>
-          <w:rFonts w:cs="Times New Roman"/>
-        </w:rPr>
-        <w:t>centre</w:t>
-      </w:r>
-      <w:proofErr w:type="spellEnd"/>
-      <w:r>
-        <w:rPr>
-          <w:rFonts w:cs="Times New Roman"/>
-        </w:rPr>
-        <w:t xml:space="preserve"> of the shell.</w:t>
+        <w:t xml:space="preserve"> inside the cavity of a spherical shell. The charges are kept near the surface of the cavity on opposite sides of the centre of the shell.</w:t>
       </w:r>
     </w:p>
     <w:p>
@@ -12018,24 +11239,6 @@
           </w:rPr>
           <m:t>=0</m:t>
         </m:r>
-        <m:r>
-          <m:rPr>
-            <m:sty m:val="p"/>
-          </m:rPr>
-          <w:rPr>
-            <w:rFonts w:ascii="Cambria Math" w:hAnsi="Cambria Math" w:cs="Times New Roman"/>
-          </w:rPr>
-          <w:tab/>
-        </m:r>
-        <m:r>
-          <m:rPr>
-            <m:sty m:val="p"/>
-          </m:rPr>
-          <w:rPr>
-            <w:rFonts w:ascii="Cambria Math" w:hAnsi="Cambria Math" w:cs="Times New Roman"/>
-          </w:rPr>
-          <w:tab/>
-        </m:r>
       </m:oMath>
     </w:p>
     <w:p>
@@ -12486,7 +11689,7 @@
         <w:rPr>
           <w:rFonts w:cs="Times New Roman"/>
         </w:rPr>
-        <w:t>[solution]</w:t>
+        <w:t>Answer: A</w:t>
       </w:r>
     </w:p>
     <w:p>
@@ -12506,7 +11709,7 @@
         <w:rPr>
           <w:rFonts w:cs="Times New Roman"/>
         </w:rPr>
-        <w:t>Option A</w:t>
+        <w:t>Explanation:</w:t>
       </w:r>
     </w:p>
     <w:p>
@@ -12526,21 +11729,7 @@
         <w:rPr>
           <w:rFonts w:cs="Times New Roman"/>
         </w:rPr>
-        <w:t>[</w:t>
-      </w:r>
-      <w:proofErr w:type="spellStart"/>
-      <w:r>
-        <w:rPr>
-          <w:rFonts w:cs="Times New Roman"/>
-        </w:rPr>
-        <w:t>Question_end</w:t>
-      </w:r>
-      <w:proofErr w:type="spellEnd"/>
-      <w:r>
-        <w:rPr>
-          <w:rFonts w:cs="Times New Roman"/>
-        </w:rPr>
-        <w:t>]</w:t>
+        <w:t>Option A is correct answer</w:t>
       </w:r>
     </w:p>
     <w:p>
@@ -12593,61 +11782,15 @@
         <w:spacing w:after="0"/>
         <w:ind w:left="709" w:hanging="709"/>
         <w:rPr>
-          <w:rFonts w:eastAsiaTheme="minorEastAsia" w:cs="Times New Roman"/>
-          <w:b/>
-          <w:bCs/>
-        </w:rPr>
-      </w:pPr>
-    </w:p>
-    <w:p>
-      <w:pPr>
-        <w:tabs>
-          <w:tab w:val="left" w:pos="709"/>
-          <w:tab w:val="left" w:pos="1134"/>
-          <w:tab w:val="left" w:pos="2694"/>
-        </w:tabs>
-        <w:spacing w:after="0"/>
-        <w:ind w:left="709" w:hanging="709"/>
-        <w:rPr>
-          <w:rFonts w:cs="Times New Roman"/>
-          <w:b/>
-          <w:bCs/>
-        </w:rPr>
-      </w:pPr>
-      <w:r>
-        <w:rPr>
-          <w:rFonts w:cs="Times New Roman"/>
-        </w:rPr>
-        <w:t>[</w:t>
-      </w:r>
-      <w:proofErr w:type="spellStart"/>
-      <w:r>
-        <w:rPr>
-          <w:rFonts w:cs="Times New Roman"/>
-        </w:rPr>
-        <w:t>Question_start</w:t>
-      </w:r>
-      <w:proofErr w:type="spellEnd"/>
-      <w:r>
-        <w:rPr>
-          <w:rFonts w:cs="Times New Roman"/>
-        </w:rPr>
-        <w:t>]</w:t>
-      </w:r>
-    </w:p>
-    <w:p>
-      <w:pPr>
-        <w:tabs>
-          <w:tab w:val="left" w:pos="709"/>
-          <w:tab w:val="left" w:pos="1134"/>
-          <w:tab w:val="left" w:pos="2694"/>
-        </w:tabs>
-        <w:spacing w:after="0"/>
-        <w:ind w:left="709" w:hanging="709"/>
-        <w:rPr>
-          <w:rFonts w:cs="Times New Roman"/>
-        </w:rPr>
-      </w:pPr>
+          <w:rFonts w:cs="Times New Roman"/>
+        </w:rPr>
+      </w:pPr>
+      <w:r>
+        <w:rPr>
+          <w:rFonts w:cs="Times New Roman"/>
+        </w:rPr>
+        <w:t>Q</w:t>
+      </w:r>
       <w:r>
         <w:rPr>
           <w:rFonts w:cs="Times New Roman"/>
@@ -12664,7 +11807,13 @@
         <w:rPr>
           <w:rFonts w:cs="Times New Roman"/>
         </w:rPr>
-        <w:t xml:space="preserve">. </w:t>
+        <w:t>)</w:t>
+      </w:r>
+      <w:r>
+        <w:rPr>
+          <w:rFonts w:cs="Times New Roman"/>
+        </w:rPr>
+        <w:t xml:space="preserve"> </w:t>
       </w:r>
       <w:r>
         <w:rPr>
@@ -13420,7 +12569,7 @@
         <w:rPr>
           <w:rFonts w:cs="Times New Roman"/>
         </w:rPr>
-        <w:t>[solution]</w:t>
+        <w:t>Answer: 101</w:t>
       </w:r>
     </w:p>
     <w:p>
@@ -13440,7 +12589,7 @@
         <w:rPr>
           <w:rFonts w:cs="Times New Roman"/>
         </w:rPr>
-        <w:t>Option A</w:t>
+        <w:t>Explanation:</w:t>
       </w:r>
     </w:p>
     <w:p>
@@ -13460,376 +12609,317 @@
         <w:rPr>
           <w:rFonts w:cs="Times New Roman"/>
         </w:rPr>
+        <w:t>101</w:t>
+      </w:r>
+      <w:r>
+        <w:rPr>
+          <w:rFonts w:cs="Times New Roman"/>
+        </w:rPr>
+        <w:t xml:space="preserve"> is correct answer</w:t>
+      </w:r>
+    </w:p>
+    <w:p>
+      <w:pPr>
+        <w:tabs>
+          <w:tab w:val="left" w:pos="709"/>
+          <w:tab w:val="left" w:pos="1134"/>
+          <w:tab w:val="left" w:pos="2694"/>
+        </w:tabs>
+        <w:spacing w:before="0" w:after="0"/>
+        <w:ind w:left="709" w:hanging="709"/>
+        <w:rPr>
+          <w:rFonts w:cs="Times New Roman"/>
+        </w:rPr>
+      </w:pPr>
+    </w:p>
+    <w:p>
+      <w:pPr>
+        <w:tabs>
+          <w:tab w:val="left" w:pos="709"/>
+          <w:tab w:val="left" w:pos="1134"/>
+          <w:tab w:val="left" w:pos="2694"/>
+        </w:tabs>
+        <w:spacing w:after="0"/>
+        <w:ind w:left="709" w:hanging="709"/>
+        <w:rPr>
+          <w:rFonts w:cs="Times New Roman"/>
+        </w:rPr>
+      </w:pPr>
+      <w:r>
+        <w:rPr>
+          <w:rFonts w:cs="Times New Roman"/>
+        </w:rPr>
+        <w:t>Q</w:t>
+      </w:r>
+      <w:r>
+        <w:rPr>
+          <w:rFonts w:cs="Times New Roman"/>
+        </w:rPr>
+        <w:t>23</w:t>
+      </w:r>
+      <w:r>
+        <w:rPr>
+          <w:rFonts w:cs="Times New Roman"/>
+        </w:rPr>
+        <w:t>)</w:t>
+      </w:r>
+      <w:r>
+        <w:rPr>
+          <w:rFonts w:cs="Times New Roman"/>
+        </w:rPr>
+        <w:t xml:space="preserve"> </w:t>
+      </w:r>
+      <w:r>
+        <w:rPr>
+          <w:rFonts w:cs="Times New Roman"/>
+        </w:rPr>
+        <w:tab/>
+      </w:r>
+      <w:r>
+        <w:rPr>
+          <w:rFonts w:cs="Times New Roman"/>
+        </w:rPr>
+        <w:t xml:space="preserve">Two identical charged spheres are suspended by strings of equal lengths. The strings make an angle 0 with cacti other When suspended in water the angle remains the same. If density of the material of the sphere is </w:t>
+      </w:r>
+      <m:oMath>
+        <m:r>
+          <m:rPr>
+            <m:sty m:val="p"/>
+          </m:rPr>
+          <w:rPr>
+            <w:rFonts w:ascii="Cambria Math" w:hAnsi="Cambria Math" w:cs="Times New Roman"/>
+          </w:rPr>
+          <m:t>1.5</m:t>
+        </m:r>
+        <m:r>
+          <m:rPr>
+            <m:nor/>
+          </m:rPr>
+          <w:rPr>
+            <w:rFonts w:cs="Times New Roman"/>
+          </w:rPr>
+          <m:t xml:space="preserve"> </m:t>
+        </m:r>
+        <m:r>
+          <m:rPr>
+            <m:sty m:val="p"/>
+          </m:rPr>
+          <w:rPr>
+            <w:rFonts w:ascii="Cambria Math" w:hAnsi="Cambria Math" w:cs="Times New Roman"/>
+          </w:rPr>
+          <m:t>g/cc</m:t>
+        </m:r>
+      </m:oMath>
+      <w:r>
+        <w:rPr>
+          <w:rFonts w:cs="Times New Roman"/>
+        </w:rPr>
+        <w:t xml:space="preserve">, the dielectric constant of water will be </w:t>
+      </w:r>
+      <w:r>
+        <w:rPr>
+          <w:rFonts w:cs="Times New Roman"/>
+        </w:rPr>
+        <w:t>_____</w:t>
+      </w:r>
+      <w:r>
+        <w:rPr>
+          <w:rFonts w:cs="Times New Roman"/>
+        </w:rPr>
+        <w:t>.</w:t>
+      </w:r>
+      <w:r>
+        <w:rPr>
+          <w:rFonts w:cs="Times New Roman"/>
+        </w:rPr>
+        <w:t xml:space="preserve"> (Take density of water = 1</w:t>
+      </w:r>
+      <w:r>
+        <w:rPr>
+          <w:rFonts w:cs="Times New Roman"/>
+        </w:rPr>
+        <w:t xml:space="preserve"> </w:t>
+      </w:r>
+      <m:oMath>
+        <m:r>
+          <m:rPr>
+            <m:sty m:val="p"/>
+          </m:rPr>
+          <w:rPr>
+            <w:rFonts w:ascii="Cambria Math" w:hAnsi="Cambria Math" w:cs="Times New Roman"/>
+          </w:rPr>
+          <m:t>g/cc</m:t>
+        </m:r>
+      </m:oMath>
+      <w:r>
+        <w:rPr>
+          <w:rFonts w:cs="Times New Roman"/>
+        </w:rPr>
+        <w:t xml:space="preserve"> )</w:t>
+      </w:r>
+    </w:p>
+    <w:p>
+      <w:pPr>
+        <w:tabs>
+          <w:tab w:val="left" w:pos="709"/>
+          <w:tab w:val="left" w:pos="1134"/>
+          <w:tab w:val="left" w:pos="2694"/>
+        </w:tabs>
+        <w:spacing w:before="0" w:after="0"/>
+        <w:ind w:left="709" w:hanging="709"/>
+        <w:jc w:val="right"/>
+        <w:rPr>
+          <w:rFonts w:cs="Times New Roman"/>
+        </w:rPr>
+      </w:pPr>
+      <w:r>
+        <w:rPr>
+          <w:rFonts w:cs="Times New Roman"/>
+        </w:rPr>
         <w:t>[</w:t>
       </w:r>
-      <w:proofErr w:type="spellStart"/>
-      <w:r>
-        <w:rPr>
-          <w:rFonts w:cs="Times New Roman"/>
-        </w:rPr>
-        <w:t>Question_end</w:t>
-      </w:r>
-      <w:proofErr w:type="spellEnd"/>
-      <w:r>
-        <w:rPr>
-          <w:rFonts w:cs="Times New Roman"/>
-        </w:rPr>
-        <w:t>]</w:t>
-      </w:r>
-    </w:p>
-    <w:p>
-      <w:pPr>
-        <w:tabs>
-          <w:tab w:val="left" w:pos="709"/>
-          <w:tab w:val="left" w:pos="1134"/>
-          <w:tab w:val="left" w:pos="2694"/>
-        </w:tabs>
-        <w:spacing w:after="0"/>
-        <w:ind w:left="709" w:hanging="709"/>
-        <w:rPr>
-          <w:rFonts w:cs="Times New Roman"/>
-        </w:rPr>
-      </w:pPr>
-    </w:p>
-    <w:p>
-      <w:pPr>
-        <w:tabs>
-          <w:tab w:val="left" w:pos="709"/>
-          <w:tab w:val="left" w:pos="1134"/>
-          <w:tab w:val="left" w:pos="2694"/>
-        </w:tabs>
-        <w:spacing w:after="0"/>
-        <w:ind w:left="709" w:hanging="709"/>
-        <w:rPr>
-          <w:rFonts w:cs="Times New Roman"/>
-        </w:rPr>
-      </w:pPr>
-      <w:r>
-        <w:rPr>
-          <w:rFonts w:cs="Times New Roman"/>
-        </w:rPr>
-        <w:t>[</w:t>
-      </w:r>
-      <w:proofErr w:type="spellStart"/>
-      <w:r>
-        <w:rPr>
-          <w:rFonts w:cs="Times New Roman"/>
-        </w:rPr>
-        <w:t>Question_start</w:t>
-      </w:r>
-      <w:proofErr w:type="spellEnd"/>
-      <w:r>
-        <w:rPr>
-          <w:rFonts w:cs="Times New Roman"/>
-        </w:rPr>
-        <w:t>]</w:t>
-      </w:r>
-    </w:p>
-    <w:p>
-      <w:pPr>
-        <w:tabs>
-          <w:tab w:val="left" w:pos="709"/>
-          <w:tab w:val="left" w:pos="1134"/>
-          <w:tab w:val="left" w:pos="2694"/>
-        </w:tabs>
-        <w:spacing w:after="0"/>
-        <w:ind w:left="709" w:hanging="709"/>
-        <w:rPr>
-          <w:rFonts w:cs="Times New Roman"/>
-        </w:rPr>
-      </w:pPr>
-      <w:r>
-        <w:rPr>
-          <w:rFonts w:cs="Times New Roman"/>
-        </w:rPr>
-        <w:t>23</w:t>
-      </w:r>
-      <w:r>
-        <w:rPr>
-          <w:rFonts w:cs="Times New Roman"/>
-        </w:rPr>
-        <w:t xml:space="preserve">. </w:t>
-      </w:r>
-      <w:r>
-        <w:rPr>
-          <w:rFonts w:cs="Times New Roman"/>
-        </w:rPr>
-        <w:tab/>
-      </w:r>
-      <w:r>
-        <w:rPr>
-          <w:rFonts w:cs="Times New Roman"/>
-        </w:rPr>
-        <w:t xml:space="preserve">Two identical charged spheres are suspended by strings of equal lengths. The strings make an angle 0 with cacti other When suspended in water the angle remains the same. If density of the material of the sphere is </w:t>
-      </w:r>
-      <m:oMath>
-        <m:r>
-          <m:rPr>
-            <m:sty m:val="p"/>
-          </m:rPr>
-          <w:rPr>
-            <w:rFonts w:ascii="Cambria Math" w:hAnsi="Cambria Math" w:cs="Times New Roman"/>
-          </w:rPr>
-          <m:t>1.5</m:t>
-        </m:r>
-        <m:r>
-          <m:rPr>
-            <m:nor/>
-          </m:rPr>
-          <w:rPr>
-            <w:rFonts w:cs="Times New Roman"/>
-          </w:rPr>
-          <m:t xml:space="preserve"> </m:t>
-        </m:r>
-        <m:r>
-          <m:rPr>
-            <m:sty m:val="p"/>
-          </m:rPr>
-          <w:rPr>
-            <w:rFonts w:ascii="Cambria Math" w:hAnsi="Cambria Math" w:cs="Times New Roman"/>
-          </w:rPr>
-          <m:t>g/cc</m:t>
-        </m:r>
-      </m:oMath>
-      <w:r>
-        <w:rPr>
-          <w:rFonts w:cs="Times New Roman"/>
-        </w:rPr>
-        <w:t xml:space="preserve">, the dielectric constant of water will be </w:t>
-      </w:r>
-      <w:r>
-        <w:rPr>
-          <w:rFonts w:cs="Times New Roman"/>
-        </w:rPr>
-        <w:t>_____</w:t>
-      </w:r>
-      <w:r>
-        <w:rPr>
-          <w:rFonts w:cs="Times New Roman"/>
-        </w:rPr>
-        <w:t>.</w:t>
-      </w:r>
-      <w:r>
-        <w:rPr>
-          <w:rFonts w:cs="Times New Roman"/>
-        </w:rPr>
-        <w:t xml:space="preserve"> (Take density of water = 1</w:t>
+      <w:r>
+        <w:rPr>
+          <w:rFonts w:cs="Times New Roman"/>
+        </w:rPr>
+        <w:t>Feb</w:t>
+      </w:r>
+      <w:r>
+        <w:rPr>
+          <w:rFonts w:cs="Times New Roman"/>
+        </w:rPr>
+        <w:t xml:space="preserve">, 1, 2024 </w:t>
+      </w:r>
+      <w:r>
+        <w:rPr>
+          <w:rFonts w:cs="Times New Roman"/>
+        </w:rPr>
+        <w:t>(II)</w:t>
+      </w:r>
+      <w:r>
+        <w:rPr>
+          <w:rFonts w:cs="Times New Roman"/>
+        </w:rPr>
+        <w:t xml:space="preserve">] </w:t>
+      </w:r>
+    </w:p>
+    <w:p>
+      <w:pPr>
+        <w:tabs>
+          <w:tab w:val="left" w:pos="709"/>
+          <w:tab w:val="left" w:pos="1134"/>
+          <w:tab w:val="left" w:pos="2694"/>
+        </w:tabs>
+        <w:spacing w:before="0" w:after="0"/>
+        <w:ind w:left="709" w:hanging="709"/>
+        <w:rPr>
+          <w:rFonts w:cs="Times New Roman"/>
+        </w:rPr>
+      </w:pPr>
+      <w:r>
+        <w:rPr>
+          <w:rFonts w:cs="Times New Roman"/>
+        </w:rPr>
+        <w:t>Answer: 101</w:t>
+      </w:r>
+    </w:p>
+    <w:p>
+      <w:pPr>
+        <w:tabs>
+          <w:tab w:val="left" w:pos="709"/>
+          <w:tab w:val="left" w:pos="1134"/>
+          <w:tab w:val="left" w:pos="2694"/>
+        </w:tabs>
+        <w:spacing w:before="0" w:after="0"/>
+        <w:ind w:left="709" w:hanging="709"/>
+        <w:rPr>
+          <w:rFonts w:cs="Times New Roman"/>
+        </w:rPr>
+      </w:pPr>
+      <w:r>
+        <w:rPr>
+          <w:rFonts w:cs="Times New Roman"/>
+        </w:rPr>
+        <w:t>Explanation:</w:t>
+      </w:r>
+    </w:p>
+    <w:p>
+      <w:pPr>
+        <w:tabs>
+          <w:tab w:val="left" w:pos="709"/>
+          <w:tab w:val="left" w:pos="1134"/>
+          <w:tab w:val="left" w:pos="2694"/>
+        </w:tabs>
+        <w:spacing w:before="0" w:after="0"/>
+        <w:ind w:left="709" w:hanging="709"/>
+        <w:rPr>
+          <w:rFonts w:cs="Times New Roman"/>
+        </w:rPr>
+      </w:pPr>
+      <w:r>
+        <w:rPr>
+          <w:rFonts w:cs="Times New Roman"/>
+        </w:rPr>
+        <w:t>101</w:t>
+      </w:r>
+      <w:r>
+        <w:rPr>
+          <w:rFonts w:cs="Times New Roman"/>
+        </w:rPr>
+        <w:t xml:space="preserve"> is correct answer</w:t>
+      </w:r>
+    </w:p>
+    <w:p>
+      <w:pPr>
+        <w:tabs>
+          <w:tab w:val="left" w:pos="709"/>
+          <w:tab w:val="left" w:pos="1134"/>
+          <w:tab w:val="left" w:pos="2694"/>
+        </w:tabs>
+        <w:spacing w:before="0" w:after="0"/>
+        <w:ind w:left="709" w:hanging="709"/>
+        <w:rPr>
+          <w:rFonts w:cs="Times New Roman"/>
+        </w:rPr>
+      </w:pPr>
+    </w:p>
+    <w:p>
+      <w:pPr>
+        <w:tabs>
+          <w:tab w:val="left" w:pos="709"/>
+          <w:tab w:val="left" w:pos="1134"/>
+          <w:tab w:val="left" w:pos="2694"/>
+        </w:tabs>
+        <w:spacing w:before="0" w:after="0"/>
+        <w:ind w:left="709" w:hanging="709"/>
+        <w:rPr>
+          <w:rFonts w:cs="Times New Roman"/>
+        </w:rPr>
+      </w:pPr>
+      <w:r>
+        <w:rPr>
+          <w:rFonts w:cs="Times New Roman"/>
+        </w:rPr>
+        <w:lastRenderedPageBreak/>
+        <w:t>Q</w:t>
+      </w:r>
+      <w:r>
+        <w:rPr>
+          <w:rFonts w:cs="Times New Roman"/>
+        </w:rPr>
+        <w:t>24</w:t>
+      </w:r>
+      <w:r>
+        <w:rPr>
+          <w:rFonts w:cs="Times New Roman"/>
+        </w:rPr>
+        <w:t>)</w:t>
       </w:r>
       <w:r>
         <w:rPr>
           <w:rFonts w:cs="Times New Roman"/>
         </w:rPr>
         <w:t xml:space="preserve"> </w:t>
-      </w:r>
-      <m:oMath>
-        <m:r>
-          <m:rPr>
-            <m:sty m:val="p"/>
-          </m:rPr>
-          <w:rPr>
-            <w:rFonts w:ascii="Cambria Math" w:hAnsi="Cambria Math" w:cs="Times New Roman"/>
-          </w:rPr>
-          <m:t>g/cc</m:t>
-        </m:r>
-      </m:oMath>
-      <w:r>
-        <w:rPr>
-          <w:rFonts w:cs="Times New Roman"/>
-        </w:rPr>
-        <w:t xml:space="preserve"> )</w:t>
-      </w:r>
-    </w:p>
-    <w:p>
-      <w:pPr>
-        <w:tabs>
-          <w:tab w:val="left" w:pos="709"/>
-          <w:tab w:val="left" w:pos="1134"/>
-          <w:tab w:val="left" w:pos="2694"/>
-        </w:tabs>
-        <w:spacing w:before="0" w:after="0"/>
-        <w:ind w:left="709" w:hanging="709"/>
-        <w:jc w:val="right"/>
-        <w:rPr>
-          <w:rFonts w:cs="Times New Roman"/>
-        </w:rPr>
-      </w:pPr>
-      <w:r>
-        <w:rPr>
-          <w:rFonts w:cs="Times New Roman"/>
-        </w:rPr>
-        <w:t>[</w:t>
-      </w:r>
-      <w:r>
-        <w:rPr>
-          <w:rFonts w:cs="Times New Roman"/>
-        </w:rPr>
-        <w:t>Feb</w:t>
-      </w:r>
-      <w:r>
-        <w:rPr>
-          <w:rFonts w:cs="Times New Roman"/>
-        </w:rPr>
-        <w:t xml:space="preserve">, 1, 2024 </w:t>
-      </w:r>
-      <w:r>
-        <w:rPr>
-          <w:rFonts w:cs="Times New Roman"/>
-        </w:rPr>
-        <w:t>(II)</w:t>
-      </w:r>
-      <w:r>
-        <w:rPr>
-          <w:rFonts w:cs="Times New Roman"/>
-        </w:rPr>
-        <w:t xml:space="preserve">] </w:t>
-      </w:r>
-    </w:p>
-    <w:p>
-      <w:pPr>
-        <w:tabs>
-          <w:tab w:val="left" w:pos="709"/>
-          <w:tab w:val="left" w:pos="1134"/>
-          <w:tab w:val="left" w:pos="2694"/>
-        </w:tabs>
-        <w:spacing w:before="0" w:after="0"/>
-        <w:ind w:left="709" w:hanging="709"/>
-        <w:rPr>
-          <w:rFonts w:cs="Times New Roman"/>
-        </w:rPr>
-      </w:pPr>
-      <w:r>
-        <w:rPr>
-          <w:rFonts w:cs="Times New Roman"/>
-        </w:rPr>
-        <w:t>[solution]</w:t>
-      </w:r>
-    </w:p>
-    <w:p>
-      <w:pPr>
-        <w:tabs>
-          <w:tab w:val="left" w:pos="709"/>
-          <w:tab w:val="left" w:pos="1134"/>
-          <w:tab w:val="left" w:pos="2694"/>
-        </w:tabs>
-        <w:spacing w:before="0" w:after="0"/>
-        <w:ind w:left="709" w:hanging="709"/>
-        <w:rPr>
-          <w:rFonts w:cs="Times New Roman"/>
-        </w:rPr>
-      </w:pPr>
-      <w:r>
-        <w:rPr>
-          <w:rFonts w:cs="Times New Roman"/>
-        </w:rPr>
-        <w:t>Option A</w:t>
-      </w:r>
-    </w:p>
-    <w:p>
-      <w:pPr>
-        <w:tabs>
-          <w:tab w:val="left" w:pos="709"/>
-          <w:tab w:val="left" w:pos="1134"/>
-          <w:tab w:val="left" w:pos="2694"/>
-        </w:tabs>
-        <w:spacing w:before="0" w:after="0"/>
-        <w:ind w:left="709" w:hanging="709"/>
-        <w:rPr>
-          <w:rFonts w:cs="Times New Roman"/>
-        </w:rPr>
-      </w:pPr>
-      <w:r>
-        <w:rPr>
-          <w:rFonts w:cs="Times New Roman"/>
-        </w:rPr>
-        <w:t>[</w:t>
-      </w:r>
-      <w:proofErr w:type="spellStart"/>
-      <w:r>
-        <w:rPr>
-          <w:rFonts w:cs="Times New Roman"/>
-        </w:rPr>
-        <w:t>Question_end</w:t>
-      </w:r>
-      <w:proofErr w:type="spellEnd"/>
-      <w:r>
-        <w:rPr>
-          <w:rFonts w:cs="Times New Roman"/>
-        </w:rPr>
-        <w:t>]</w:t>
-      </w:r>
-    </w:p>
-    <w:p>
-      <w:pPr>
-        <w:tabs>
-          <w:tab w:val="left" w:pos="709"/>
-          <w:tab w:val="left" w:pos="1134"/>
-          <w:tab w:val="left" w:pos="2694"/>
-        </w:tabs>
-        <w:spacing w:before="0" w:after="0"/>
-        <w:ind w:left="709" w:hanging="709"/>
-        <w:rPr>
-          <w:rFonts w:cs="Times New Roman"/>
-        </w:rPr>
-      </w:pPr>
-    </w:p>
-    <w:p>
-      <w:pPr>
-        <w:tabs>
-          <w:tab w:val="left" w:pos="709"/>
-          <w:tab w:val="left" w:pos="1134"/>
-          <w:tab w:val="left" w:pos="2694"/>
-        </w:tabs>
-        <w:spacing w:before="0" w:after="0"/>
-        <w:ind w:left="709" w:hanging="709"/>
-        <w:rPr>
-          <w:rFonts w:cs="Times New Roman"/>
-        </w:rPr>
-      </w:pPr>
-      <w:r>
-        <w:rPr>
-          <w:rFonts w:cs="Times New Roman"/>
-        </w:rPr>
-        <w:t>[</w:t>
-      </w:r>
-      <w:proofErr w:type="spellStart"/>
-      <w:r>
-        <w:rPr>
-          <w:rFonts w:cs="Times New Roman"/>
-        </w:rPr>
-        <w:t>Question_start</w:t>
-      </w:r>
-      <w:proofErr w:type="spellEnd"/>
-      <w:r>
-        <w:rPr>
-          <w:rFonts w:cs="Times New Roman"/>
-        </w:rPr>
-        <w:t>]</w:t>
-      </w:r>
-    </w:p>
-    <w:p>
-      <w:pPr>
-        <w:tabs>
-          <w:tab w:val="left" w:pos="709"/>
-          <w:tab w:val="left" w:pos="1134"/>
-          <w:tab w:val="left" w:pos="2694"/>
-        </w:tabs>
-        <w:spacing w:before="0" w:after="0"/>
-        <w:ind w:left="709" w:hanging="709"/>
-        <w:rPr>
-          <w:rFonts w:cs="Times New Roman"/>
-        </w:rPr>
-      </w:pPr>
-      <w:r>
-        <w:rPr>
-          <w:rFonts w:cs="Times New Roman"/>
-        </w:rPr>
-        <w:t>24</w:t>
-      </w:r>
-      <w:r>
-        <w:rPr>
-          <w:rFonts w:cs="Times New Roman"/>
-        </w:rPr>
-        <w:t xml:space="preserve">. </w:t>
       </w:r>
       <w:r>
         <w:rPr>
@@ -13907,49 +12997,7 @@
         <w:rPr>
           <w:rFonts w:cs="Times New Roman"/>
         </w:rPr>
-        <w:t xml:space="preserve"> normally: A charged particle of mass 2 g being suspended through a silk thread </w:t>
-      </w:r>
-      <w:proofErr w:type="gramStart"/>
-      <w:r>
-        <w:rPr>
-          <w:rFonts w:cs="Times New Roman"/>
-        </w:rPr>
-        <w:t>of length</w:t>
-      </w:r>
-      <w:proofErr w:type="gramEnd"/>
-      <w:r>
-        <w:rPr>
-          <w:rFonts w:cs="Times New Roman"/>
-        </w:rPr>
-        <w:t xml:space="preserve"> 20 cm and </w:t>
-      </w:r>
-      <w:proofErr w:type="gramStart"/>
-      <w:r>
-        <w:rPr>
-          <w:rFonts w:cs="Times New Roman"/>
-        </w:rPr>
-        <w:t>remain stayed</w:t>
-      </w:r>
-      <w:proofErr w:type="gramEnd"/>
-      <w:r>
-        <w:rPr>
-          <w:rFonts w:cs="Times New Roman"/>
-        </w:rPr>
-        <w:t xml:space="preserve"> at </w:t>
-      </w:r>
-      <w:proofErr w:type="gramStart"/>
-      <w:r>
-        <w:rPr>
-          <w:rFonts w:cs="Times New Roman"/>
-        </w:rPr>
-        <w:t>a distance of 10</w:t>
-      </w:r>
-      <w:proofErr w:type="gramEnd"/>
-      <w:r>
-        <w:rPr>
-          <w:rFonts w:cs="Times New Roman"/>
-        </w:rPr>
-        <w:t xml:space="preserve"> cm from the wall. Then the charge on the particle will be </w:t>
+        <w:t xml:space="preserve"> normally: A charged particle of mass 2 g being suspended through a silk thread of length 20 cm and remain stayed at a distance of 10 cm from the wall. Then the charge on the particle will be </w:t>
       </w:r>
       <m:oMath>
         <m:f>
@@ -14190,7 +13238,7 @@
         <w:rPr>
           <w:rFonts w:cs="Times New Roman"/>
         </w:rPr>
-        <w:t>[solution]</w:t>
+        <w:t>Answer: 101</w:t>
       </w:r>
     </w:p>
     <w:p>
@@ -14210,7 +13258,7 @@
         <w:rPr>
           <w:rFonts w:cs="Times New Roman"/>
         </w:rPr>
-        <w:t>Option A</w:t>
+        <w:t>Explanation:</w:t>
       </w:r>
     </w:p>
     <w:p>
@@ -14230,21 +13278,13 @@
         <w:rPr>
           <w:rFonts w:cs="Times New Roman"/>
         </w:rPr>
-        <w:t>[</w:t>
-      </w:r>
-      <w:proofErr w:type="spellStart"/>
-      <w:r>
-        <w:rPr>
-          <w:rFonts w:cs="Times New Roman"/>
-        </w:rPr>
-        <w:t>Question_end</w:t>
-      </w:r>
-      <w:proofErr w:type="spellEnd"/>
-      <w:r>
-        <w:rPr>
-          <w:rFonts w:cs="Times New Roman"/>
-        </w:rPr>
-        <w:t>]</w:t>
+        <w:t>101</w:t>
+      </w:r>
+      <w:r>
+        <w:rPr>
+          <w:rFonts w:cs="Times New Roman"/>
+        </w:rPr>
+        <w:t xml:space="preserve"> is correct answer</w:t>
       </w:r>
     </w:p>
     <w:p>
@@ -14278,36 +13318,8 @@
         <w:rPr>
           <w:rFonts w:cs="Times New Roman"/>
         </w:rPr>
-        <w:t>[</w:t>
-      </w:r>
-      <w:proofErr w:type="spellStart"/>
-      <w:r>
-        <w:rPr>
-          <w:rFonts w:cs="Times New Roman"/>
-        </w:rPr>
-        <w:t>Question_start</w:t>
-      </w:r>
-      <w:proofErr w:type="spellEnd"/>
-      <w:r>
-        <w:rPr>
-          <w:rFonts w:cs="Times New Roman"/>
-        </w:rPr>
-        <w:t>]</w:t>
-      </w:r>
-    </w:p>
-    <w:p>
-      <w:pPr>
-        <w:tabs>
-          <w:tab w:val="left" w:pos="709"/>
-          <w:tab w:val="left" w:pos="1134"/>
-          <w:tab w:val="left" w:pos="2694"/>
-        </w:tabs>
-        <w:spacing w:after="0"/>
-        <w:ind w:left="709" w:hanging="709"/>
-        <w:rPr>
-          <w:rFonts w:cs="Times New Roman"/>
-        </w:rPr>
-      </w:pPr>
+        <w:t>Q</w:t>
+      </w:r>
       <w:r>
         <w:rPr>
           <w:rFonts w:cs="Times New Roman"/>
@@ -14318,7 +13330,13 @@
         <w:rPr>
           <w:rFonts w:cs="Times New Roman"/>
         </w:rPr>
-        <w:t xml:space="preserve">. </w:t>
+        <w:t>)</w:t>
+      </w:r>
+      <w:r>
+        <w:rPr>
+          <w:rFonts w:cs="Times New Roman"/>
+        </w:rPr>
+        <w:t xml:space="preserve"> </w:t>
       </w:r>
       <w:r>
         <w:rPr>
@@ -14677,7 +13695,7 @@
         <w:rPr>
           <w:rFonts w:cs="Times New Roman"/>
         </w:rPr>
-        <w:t>[solution]</w:t>
+        <w:t>Answer: 101</w:t>
       </w:r>
     </w:p>
     <w:p>
@@ -14697,7 +13715,7 @@
         <w:rPr>
           <w:rFonts w:cs="Times New Roman"/>
         </w:rPr>
-        <w:t>Option A</w:t>
+        <w:t>Explanation:</w:t>
       </w:r>
     </w:p>
     <w:p>
@@ -14717,22 +13735,28 @@
         <w:rPr>
           <w:rFonts w:cs="Times New Roman"/>
         </w:rPr>
-        <w:t>[</w:t>
-      </w:r>
-      <w:proofErr w:type="spellStart"/>
-      <w:r>
-        <w:rPr>
-          <w:rFonts w:cs="Times New Roman"/>
-        </w:rPr>
-        <w:t>Question_end</w:t>
-      </w:r>
-      <w:proofErr w:type="spellEnd"/>
-      <w:r>
-        <w:rPr>
-          <w:rFonts w:cs="Times New Roman"/>
-        </w:rPr>
-        <w:t>]</w:t>
-      </w:r>
+        <w:t>101</w:t>
+      </w:r>
+      <w:r>
+        <w:rPr>
+          <w:rFonts w:cs="Times New Roman"/>
+        </w:rPr>
+        <w:t xml:space="preserve"> is correct answer</w:t>
+      </w:r>
+    </w:p>
+    <w:p>
+      <w:pPr>
+        <w:tabs>
+          <w:tab w:val="left" w:pos="709"/>
+          <w:tab w:val="left" w:pos="1134"/>
+          <w:tab w:val="left" w:pos="2694"/>
+        </w:tabs>
+        <w:spacing w:before="0" w:after="0"/>
+        <w:ind w:left="709" w:hanging="709"/>
+        <w:rPr>
+          <w:rFonts w:cs="Times New Roman"/>
+        </w:rPr>
+      </w:pPr>
     </w:p>
     <w:p>
       <w:pPr>
@@ -14747,54 +13771,12 @@
           <w:rFonts w:cs="Times New Roman"/>
         </w:rPr>
       </w:pPr>
-    </w:p>
-    <w:p>
-      <w:pPr>
-        <w:tabs>
-          <w:tab w:val="left" w:pos="709"/>
-          <w:tab w:val="left" w:pos="1134"/>
-          <w:tab w:val="left" w:pos="2694"/>
-        </w:tabs>
-        <w:spacing w:after="0"/>
-        <w:ind w:left="709" w:hanging="709"/>
-        <w:rPr>
-          <w:rFonts w:cs="Times New Roman"/>
-        </w:rPr>
-      </w:pPr>
-      <w:r>
-        <w:rPr>
-          <w:rFonts w:cs="Times New Roman"/>
-        </w:rPr>
-        <w:t>[</w:t>
-      </w:r>
-      <w:proofErr w:type="spellStart"/>
-      <w:r>
-        <w:rPr>
-          <w:rFonts w:cs="Times New Roman"/>
-        </w:rPr>
-        <w:t>Question_start</w:t>
-      </w:r>
-      <w:proofErr w:type="spellEnd"/>
-      <w:r>
-        <w:rPr>
-          <w:rFonts w:cs="Times New Roman"/>
-        </w:rPr>
-        <w:t>]</w:t>
-      </w:r>
-    </w:p>
-    <w:p>
-      <w:pPr>
-        <w:tabs>
-          <w:tab w:val="left" w:pos="709"/>
-          <w:tab w:val="left" w:pos="1134"/>
-          <w:tab w:val="left" w:pos="2694"/>
-        </w:tabs>
-        <w:spacing w:after="0"/>
-        <w:ind w:left="709" w:hanging="709"/>
-        <w:rPr>
-          <w:rFonts w:cs="Times New Roman"/>
-        </w:rPr>
-      </w:pPr>
+      <w:r>
+        <w:rPr>
+          <w:rFonts w:cs="Times New Roman"/>
+        </w:rPr>
+        <w:t>Q</w:t>
+      </w:r>
       <w:r>
         <w:rPr>
           <w:rFonts w:cs="Times New Roman"/>
@@ -14805,7 +13787,13 @@
         <w:rPr>
           <w:rFonts w:cs="Times New Roman"/>
         </w:rPr>
-        <w:t xml:space="preserve">. </w:t>
+        <w:t>)</w:t>
+      </w:r>
+      <w:r>
+        <w:rPr>
+          <w:rFonts w:cs="Times New Roman"/>
+        </w:rPr>
+        <w:t xml:space="preserve"> </w:t>
       </w:r>
       <w:r>
         <w:rPr>
@@ -15122,7 +14110,7 @@
         <w:rPr>
           <w:rFonts w:cs="Times New Roman"/>
         </w:rPr>
-        <w:t>[solution]</w:t>
+        <w:t>Answer: 101</w:t>
       </w:r>
     </w:p>
     <w:p>
@@ -15142,7 +14130,7 @@
         <w:rPr>
           <w:rFonts w:cs="Times New Roman"/>
         </w:rPr>
-        <w:t>Option A</w:t>
+        <w:t>Explanation:</w:t>
       </w:r>
     </w:p>
     <w:p>
@@ -15162,21 +14150,13 @@
         <w:rPr>
           <w:rFonts w:cs="Times New Roman"/>
         </w:rPr>
-        <w:t>[</w:t>
-      </w:r>
-      <w:proofErr w:type="spellStart"/>
-      <w:r>
-        <w:rPr>
-          <w:rFonts w:cs="Times New Roman"/>
-        </w:rPr>
-        <w:t>Question_end</w:t>
-      </w:r>
-      <w:proofErr w:type="spellEnd"/>
-      <w:r>
-        <w:rPr>
-          <w:rFonts w:cs="Times New Roman"/>
-        </w:rPr>
-        <w:t>]</w:t>
+        <w:t>101</w:t>
+      </w:r>
+      <w:r>
+        <w:rPr>
+          <w:rFonts w:cs="Times New Roman"/>
+        </w:rPr>
+        <w:t xml:space="preserve"> is correct answer</w:t>
       </w:r>
     </w:p>
     <w:p>
@@ -15210,36 +14190,8 @@
         <w:rPr>
           <w:rFonts w:cs="Times New Roman"/>
         </w:rPr>
-        <w:t>[</w:t>
-      </w:r>
-      <w:proofErr w:type="spellStart"/>
-      <w:r>
-        <w:rPr>
-          <w:rFonts w:cs="Times New Roman"/>
-        </w:rPr>
-        <w:t>Question_start</w:t>
-      </w:r>
-      <w:proofErr w:type="spellEnd"/>
-      <w:r>
-        <w:rPr>
-          <w:rFonts w:cs="Times New Roman"/>
-        </w:rPr>
-        <w:t>]</w:t>
-      </w:r>
-    </w:p>
-    <w:p>
-      <w:pPr>
-        <w:tabs>
-          <w:tab w:val="left" w:pos="709"/>
-          <w:tab w:val="left" w:pos="1134"/>
-          <w:tab w:val="left" w:pos="2694"/>
-        </w:tabs>
-        <w:spacing w:after="0"/>
-        <w:ind w:left="709" w:hanging="709"/>
-        <w:rPr>
-          <w:rFonts w:cs="Times New Roman"/>
-        </w:rPr>
-      </w:pPr>
+        <w:t>Q</w:t>
+      </w:r>
       <w:r>
         <w:rPr>
           <w:rFonts w:cs="Times New Roman"/>
@@ -15250,7 +14202,13 @@
         <w:rPr>
           <w:rFonts w:cs="Times New Roman"/>
         </w:rPr>
-        <w:t xml:space="preserve">. </w:t>
+        <w:t>)</w:t>
+      </w:r>
+      <w:r>
+        <w:rPr>
+          <w:rFonts w:cs="Times New Roman"/>
+        </w:rPr>
+        <w:t xml:space="preserve"> </w:t>
       </w:r>
       <w:r>
         <w:rPr>
@@ -15710,7 +14668,7 @@
         <w:rPr>
           <w:rFonts w:cs="Times New Roman"/>
         </w:rPr>
-        <w:t>[solution]</w:t>
+        <w:t>Answer: 101</w:t>
       </w:r>
     </w:p>
     <w:p>
@@ -15730,7 +14688,7 @@
         <w:rPr>
           <w:rFonts w:cs="Times New Roman"/>
         </w:rPr>
-        <w:t>Option A</w:t>
+        <w:t>Explanation:</w:t>
       </w:r>
     </w:p>
     <w:p>
@@ -15750,21 +14708,13 @@
         <w:rPr>
           <w:rFonts w:cs="Times New Roman"/>
         </w:rPr>
-        <w:t>[</w:t>
-      </w:r>
-      <w:proofErr w:type="spellStart"/>
-      <w:r>
-        <w:rPr>
-          <w:rFonts w:cs="Times New Roman"/>
-        </w:rPr>
-        <w:t>Question_end</w:t>
-      </w:r>
-      <w:proofErr w:type="spellEnd"/>
-      <w:r>
-        <w:rPr>
-          <w:rFonts w:cs="Times New Roman"/>
-        </w:rPr>
-        <w:t>]</w:t>
+        <w:t>101</w:t>
+      </w:r>
+      <w:r>
+        <w:rPr>
+          <w:rFonts w:cs="Times New Roman"/>
+        </w:rPr>
+        <w:t xml:space="preserve"> is correct answer</w:t>
       </w:r>
     </w:p>
     <w:p>
@@ -15798,36 +14748,9 @@
         <w:rPr>
           <w:rFonts w:cs="Times New Roman"/>
         </w:rPr>
-        <w:t>[</w:t>
-      </w:r>
-      <w:proofErr w:type="spellStart"/>
-      <w:r>
-        <w:rPr>
-          <w:rFonts w:cs="Times New Roman"/>
-        </w:rPr>
-        <w:t>Question_start</w:t>
-      </w:r>
-      <w:proofErr w:type="spellEnd"/>
-      <w:r>
-        <w:rPr>
-          <w:rFonts w:cs="Times New Roman"/>
-        </w:rPr>
-        <w:t>]</w:t>
-      </w:r>
-    </w:p>
-    <w:p>
-      <w:pPr>
-        <w:tabs>
-          <w:tab w:val="left" w:pos="709"/>
-          <w:tab w:val="left" w:pos="1134"/>
-          <w:tab w:val="left" w:pos="2694"/>
-        </w:tabs>
-        <w:spacing w:after="0"/>
-        <w:ind w:left="709" w:hanging="709"/>
-        <w:rPr>
-          <w:rFonts w:cs="Times New Roman"/>
-        </w:rPr>
-      </w:pPr>
+        <w:lastRenderedPageBreak/>
+        <w:t>Q</w:t>
+      </w:r>
       <w:r>
         <w:rPr>
           <w:rFonts w:cs="Times New Roman"/>
@@ -15838,7 +14761,13 @@
         <w:rPr>
           <w:rFonts w:cs="Times New Roman"/>
         </w:rPr>
-        <w:t xml:space="preserve">. </w:t>
+        <w:t>)</w:t>
+      </w:r>
+      <w:r>
+        <w:rPr>
+          <w:rFonts w:cs="Times New Roman"/>
+        </w:rPr>
+        <w:t xml:space="preserve"> </w:t>
       </w:r>
       <w:r>
         <w:rPr>
@@ -16074,7 +15003,7 @@
         <w:rPr>
           <w:rFonts w:cs="Times New Roman"/>
         </w:rPr>
-        <w:t>[solution]</w:t>
+        <w:t>Answer: 101</w:t>
       </w:r>
     </w:p>
     <w:p>
@@ -16094,7 +15023,7 @@
         <w:rPr>
           <w:rFonts w:cs="Times New Roman"/>
         </w:rPr>
-        <w:t>Option A</w:t>
+        <w:t>Explanation:</w:t>
       </w:r>
     </w:p>
     <w:p>
@@ -16114,21 +15043,13 @@
         <w:rPr>
           <w:rFonts w:cs="Times New Roman"/>
         </w:rPr>
-        <w:t>[</w:t>
-      </w:r>
-      <w:proofErr w:type="spellStart"/>
-      <w:r>
-        <w:rPr>
-          <w:rFonts w:cs="Times New Roman"/>
-        </w:rPr>
-        <w:t>Question_end</w:t>
-      </w:r>
-      <w:proofErr w:type="spellEnd"/>
-      <w:r>
-        <w:rPr>
-          <w:rFonts w:cs="Times New Roman"/>
-        </w:rPr>
-        <w:t>]</w:t>
+        <w:t>101</w:t>
+      </w:r>
+      <w:r>
+        <w:rPr>
+          <w:rFonts w:cs="Times New Roman"/>
+        </w:rPr>
+        <w:t xml:space="preserve"> is correct answer</w:t>
       </w:r>
     </w:p>
     <w:p>
@@ -16258,41 +15179,19 @@
         <w:rPr>
           <w:rFonts w:cs="Times New Roman"/>
         </w:rPr>
-        <w:t>[</w:t>
-      </w:r>
-      <w:proofErr w:type="spellStart"/>
-      <w:r>
-        <w:rPr>
-          <w:rFonts w:cs="Times New Roman"/>
-        </w:rPr>
-        <w:t>Question_start</w:t>
-      </w:r>
-      <w:proofErr w:type="spellEnd"/>
-      <w:r>
-        <w:rPr>
-          <w:rFonts w:cs="Times New Roman"/>
-        </w:rPr>
-        <w:t>]</w:t>
-      </w:r>
-    </w:p>
-    <w:p>
-      <w:pPr>
-        <w:tabs>
-          <w:tab w:val="left" w:pos="709"/>
-          <w:tab w:val="left" w:pos="1134"/>
-          <w:tab w:val="left" w:pos="2694"/>
-        </w:tabs>
-        <w:spacing w:after="0"/>
-        <w:ind w:left="709" w:hanging="709"/>
-        <w:rPr>
-          <w:rFonts w:cs="Times New Roman"/>
-        </w:rPr>
-      </w:pPr>
-      <w:r>
-        <w:rPr>
-          <w:rFonts w:cs="Times New Roman"/>
-        </w:rPr>
-        <w:t>1.</w:t>
+        <w:t>Q</w:t>
+      </w:r>
+      <w:r>
+        <w:rPr>
+          <w:rFonts w:cs="Times New Roman"/>
+        </w:rPr>
+        <w:t>1</w:t>
+      </w:r>
+      <w:r>
+        <w:rPr>
+          <w:rFonts w:cs="Times New Roman"/>
+        </w:rPr>
+        <w:t>)</w:t>
       </w:r>
       <w:r>
         <w:rPr>
@@ -16344,14 +15243,7 @@
         <w:rPr>
           <w:rFonts w:cs="Times New Roman"/>
         </w:rPr>
-        <w:t xml:space="preserve">conducting, circular hoop of radius R . One of the beads is glued to the hoop at some point, while the other one </w:t>
-      </w:r>
-      <w:r>
-        <w:rPr>
-          <w:rFonts w:cs="Times New Roman"/>
-        </w:rPr>
-        <w:lastRenderedPageBreak/>
-        <w:t xml:space="preserve">performs small oscillations about its equilibrium position along the hoop. The square of the angular frequency of the small oscillations is given by [ </w:t>
+        <w:t xml:space="preserve">conducting, circular hoop of radius R . One of the beads is glued to the hoop at some point, while the other one performs small oscillations about its equilibrium position along the hoop. The square of the angular frequency of the small oscillations is given by [ </w:t>
       </w:r>
       <m:oMath>
         <m:sSub>
@@ -17081,7 +15973,7 @@
         <w:rPr>
           <w:rFonts w:cs="Times New Roman"/>
         </w:rPr>
-        <w:t>[solution]</w:t>
+        <w:t>Answer: A</w:t>
       </w:r>
     </w:p>
     <w:p>
@@ -17101,7 +15993,7 @@
         <w:rPr>
           <w:rFonts w:cs="Times New Roman"/>
         </w:rPr>
-        <w:t>Option A</w:t>
+        <w:t>Explanation:</w:t>
       </w:r>
     </w:p>
     <w:p>
@@ -17121,21 +16013,7 @@
         <w:rPr>
           <w:rFonts w:cs="Times New Roman"/>
         </w:rPr>
-        <w:t>[</w:t>
-      </w:r>
-      <w:proofErr w:type="spellStart"/>
-      <w:r>
-        <w:rPr>
-          <w:rFonts w:cs="Times New Roman"/>
-        </w:rPr>
-        <w:t>Question_end</w:t>
-      </w:r>
-      <w:proofErr w:type="spellEnd"/>
-      <w:r>
-        <w:rPr>
-          <w:rFonts w:cs="Times New Roman"/>
-        </w:rPr>
-        <w:t>]</w:t>
+        <w:t>Option A is correct answer</w:t>
       </w:r>
     </w:p>
     <w:p>
@@ -17270,41 +16148,19 @@
         <w:rPr>
           <w:rFonts w:cs="Times New Roman"/>
         </w:rPr>
-        <w:t>[</w:t>
-      </w:r>
-      <w:proofErr w:type="spellStart"/>
-      <w:r>
-        <w:rPr>
-          <w:rFonts w:cs="Times New Roman"/>
-        </w:rPr>
-        <w:t>Question_start</w:t>
-      </w:r>
-      <w:proofErr w:type="spellEnd"/>
-      <w:r>
-        <w:rPr>
-          <w:rFonts w:cs="Times New Roman"/>
-        </w:rPr>
-        <w:t>]</w:t>
-      </w:r>
-    </w:p>
-    <w:p>
-      <w:pPr>
-        <w:tabs>
-          <w:tab w:val="left" w:pos="709"/>
-          <w:tab w:val="left" w:pos="1134"/>
-          <w:tab w:val="left" w:pos="2694"/>
-        </w:tabs>
-        <w:spacing w:after="0"/>
-        <w:ind w:left="709" w:hanging="709"/>
-        <w:rPr>
-          <w:rFonts w:cs="Times New Roman"/>
-        </w:rPr>
-      </w:pPr>
-      <w:r>
-        <w:rPr>
-          <w:rFonts w:cs="Times New Roman"/>
-        </w:rPr>
-        <w:t>2.</w:t>
+        <w:t>Q</w:t>
+      </w:r>
+      <w:r>
+        <w:rPr>
+          <w:rFonts w:cs="Times New Roman"/>
+        </w:rPr>
+        <w:t>2</w:t>
+      </w:r>
+      <w:r>
+        <w:rPr>
+          <w:rFonts w:cs="Times New Roman"/>
+        </w:rPr>
+        <w:t>)</w:t>
       </w:r>
       <w:r>
         <w:rPr>
@@ -17316,21 +16172,7 @@
         <w:rPr>
           <w:rFonts w:cs="Times New Roman"/>
         </w:rPr>
-        <w:t xml:space="preserve">Two identical non-conducting solid spheres of same mass and charge are </w:t>
-      </w:r>
-      <w:proofErr w:type="spellStart"/>
-      <w:r>
-        <w:rPr>
-          <w:rFonts w:cs="Times New Roman"/>
-        </w:rPr>
-        <w:t>susponded</w:t>
-      </w:r>
-      <w:proofErr w:type="spellEnd"/>
-      <w:r>
-        <w:rPr>
-          <w:rFonts w:cs="Times New Roman"/>
-        </w:rPr>
-        <w:t xml:space="preserve"> in air from a common point by two nonconducting, massless strings of same length. At equilibrium, the angle between the strings is </w:t>
+        <w:t xml:space="preserve">Two identical non-conducting solid spheres of same mass and charge are susponded in air from a common point by two nonconducting, massless strings of same length. At equilibrium, the angle between the strings is </w:t>
       </w:r>
       <m:oMath>
         <m:r>
@@ -17392,21 +16234,7 @@
         <w:rPr>
           <w:rFonts w:cs="Times New Roman"/>
         </w:rPr>
-        <w:t xml:space="preserve"> and dielectric constant 21. If the angle between the strings remains the same </w:t>
-      </w:r>
-      <w:proofErr w:type="spellStart"/>
-      <w:r>
-        <w:rPr>
-          <w:rFonts w:cs="Times New Roman"/>
-        </w:rPr>
-        <w:t>affer</w:t>
-      </w:r>
-      <w:proofErr w:type="spellEnd"/>
-      <w:r>
-        <w:rPr>
-          <w:rFonts w:cs="Times New Roman"/>
-        </w:rPr>
-        <w:t xml:space="preserve"> the immersion, then</w:t>
+        <w:t xml:space="preserve"> and dielectric constant 21. If the angle between the strings remains the same affer the immersion, then</w:t>
       </w:r>
     </w:p>
     <w:p>
@@ -17665,7 +16493,13 @@
         <w:rPr>
           <w:rFonts w:cs="Times New Roman"/>
         </w:rPr>
-        <w:t>[solution]</w:t>
+        <w:t>Answer: A</w:t>
+      </w:r>
+      <w:r>
+        <w:rPr>
+          <w:rFonts w:cs="Times New Roman"/>
+        </w:rPr>
+        <w:t>, D</w:t>
       </w:r>
     </w:p>
     <w:p>
@@ -17685,41 +16519,39 @@
         <w:rPr>
           <w:rFonts w:cs="Times New Roman"/>
         </w:rPr>
+        <w:t>Explanation:</w:t>
+      </w:r>
+    </w:p>
+    <w:p>
+      <w:pPr>
+        <w:tabs>
+          <w:tab w:val="left" w:pos="709"/>
+          <w:tab w:val="left" w:pos="1134"/>
+          <w:tab w:val="left" w:pos="2694"/>
+        </w:tabs>
+        <w:spacing w:before="0" w:after="0"/>
+        <w:ind w:left="709" w:hanging="709"/>
+        <w:rPr>
+          <w:rFonts w:cs="Times New Roman"/>
+        </w:rPr>
+      </w:pPr>
+      <w:r>
+        <w:rPr>
+          <w:rFonts w:cs="Times New Roman"/>
+        </w:rPr>
         <w:t>Option A</w:t>
       </w:r>
-    </w:p>
-    <w:p>
-      <w:pPr>
-        <w:tabs>
-          <w:tab w:val="left" w:pos="709"/>
-          <w:tab w:val="left" w:pos="1134"/>
-          <w:tab w:val="left" w:pos="2694"/>
-        </w:tabs>
-        <w:spacing w:before="0" w:after="0"/>
-        <w:ind w:left="709" w:hanging="709"/>
-        <w:rPr>
-          <w:rFonts w:cs="Times New Roman"/>
-        </w:rPr>
-      </w:pPr>
-      <w:r>
-        <w:rPr>
-          <w:rFonts w:cs="Times New Roman"/>
-        </w:rPr>
-        <w:t>[</w:t>
-      </w:r>
-      <w:proofErr w:type="spellStart"/>
-      <w:r>
-        <w:rPr>
-          <w:rFonts w:cs="Times New Roman"/>
-        </w:rPr>
-        <w:t>Question_end</w:t>
-      </w:r>
-      <w:proofErr w:type="spellEnd"/>
-      <w:r>
-        <w:rPr>
-          <w:rFonts w:cs="Times New Roman"/>
-        </w:rPr>
-        <w:t>]</w:t>
+      <w:r>
+        <w:rPr>
+          <w:rFonts w:cs="Times New Roman"/>
+        </w:rPr>
+        <w:t xml:space="preserve"> &amp; D</w:t>
+      </w:r>
+      <w:r>
+        <w:rPr>
+          <w:rFonts w:cs="Times New Roman"/>
+        </w:rPr>
+        <w:t xml:space="preserve"> is correct answer</w:t>
       </w:r>
     </w:p>
     <w:p>
@@ -17753,41 +16585,19 @@
         <w:rPr>
           <w:rFonts w:cs="Times New Roman"/>
         </w:rPr>
-        <w:t>[</w:t>
-      </w:r>
-      <w:proofErr w:type="spellStart"/>
-      <w:r>
-        <w:rPr>
-          <w:rFonts w:cs="Times New Roman"/>
-        </w:rPr>
-        <w:t>Question_start</w:t>
-      </w:r>
-      <w:proofErr w:type="spellEnd"/>
-      <w:r>
-        <w:rPr>
-          <w:rFonts w:cs="Times New Roman"/>
-        </w:rPr>
-        <w:t>]</w:t>
-      </w:r>
-    </w:p>
-    <w:p>
-      <w:pPr>
-        <w:tabs>
-          <w:tab w:val="left" w:pos="709"/>
-          <w:tab w:val="left" w:pos="1134"/>
-          <w:tab w:val="left" w:pos="2694"/>
-        </w:tabs>
-        <w:spacing w:after="0"/>
-        <w:ind w:left="709" w:hanging="709"/>
-        <w:rPr>
-          <w:rFonts w:cs="Times New Roman"/>
-        </w:rPr>
-      </w:pPr>
-      <w:r>
-        <w:rPr>
-          <w:rFonts w:cs="Times New Roman"/>
-        </w:rPr>
-        <w:t>3.</w:t>
+        <w:t>Q</w:t>
+      </w:r>
+      <w:r>
+        <w:rPr>
+          <w:rFonts w:cs="Times New Roman"/>
+        </w:rPr>
+        <w:t>3</w:t>
+      </w:r>
+      <w:r>
+        <w:rPr>
+          <w:rFonts w:cs="Times New Roman"/>
+        </w:rPr>
+        <w:t>)</w:t>
       </w:r>
       <w:r>
         <w:rPr>
@@ -18182,6 +16992,7 @@
               <w:rPr>
                 <w:rFonts w:cs="Times New Roman"/>
               </w:rPr>
+              <w:lastRenderedPageBreak/>
               <w:t>List-I</w:t>
             </w:r>
           </w:p>
@@ -19081,7 +17892,6 @@
         <w:rPr>
           <w:rFonts w:cs="Times New Roman"/>
         </w:rPr>
-        <w:lastRenderedPageBreak/>
         <w:tab/>
       </w:r>
       <w:r>
@@ -19420,7 +18230,13 @@
         <w:rPr>
           <w:rFonts w:cs="Times New Roman"/>
         </w:rPr>
-        <w:t>[solution]</w:t>
+        <w:t>Answer: A</w:t>
+      </w:r>
+      <w:r>
+        <w:rPr>
+          <w:rFonts w:cs="Times New Roman"/>
+        </w:rPr>
+        <w:t>, B, C</w:t>
       </w:r>
     </w:p>
     <w:p>
@@ -19440,41 +18256,39 @@
         <w:rPr>
           <w:rFonts w:cs="Times New Roman"/>
         </w:rPr>
+        <w:t>Explanation:</w:t>
+      </w:r>
+    </w:p>
+    <w:p>
+      <w:pPr>
+        <w:tabs>
+          <w:tab w:val="left" w:pos="709"/>
+          <w:tab w:val="left" w:pos="1134"/>
+          <w:tab w:val="left" w:pos="2694"/>
+        </w:tabs>
+        <w:spacing w:before="0" w:after="0"/>
+        <w:ind w:left="709" w:hanging="709"/>
+        <w:rPr>
+          <w:rFonts w:cs="Times New Roman"/>
+        </w:rPr>
+      </w:pPr>
+      <w:r>
+        <w:rPr>
+          <w:rFonts w:cs="Times New Roman"/>
+        </w:rPr>
         <w:t>Option A</w:t>
       </w:r>
-    </w:p>
-    <w:p>
-      <w:pPr>
-        <w:tabs>
-          <w:tab w:val="left" w:pos="709"/>
-          <w:tab w:val="left" w:pos="1134"/>
-          <w:tab w:val="left" w:pos="2694"/>
-        </w:tabs>
-        <w:spacing w:before="0" w:after="0"/>
-        <w:ind w:left="709" w:hanging="709"/>
-        <w:rPr>
-          <w:rFonts w:cs="Times New Roman"/>
-        </w:rPr>
-      </w:pPr>
-      <w:r>
-        <w:rPr>
-          <w:rFonts w:cs="Times New Roman"/>
-        </w:rPr>
-        <w:t>[</w:t>
-      </w:r>
-      <w:proofErr w:type="spellStart"/>
-      <w:r>
-        <w:rPr>
-          <w:rFonts w:cs="Times New Roman"/>
-        </w:rPr>
-        <w:t>Question_end</w:t>
-      </w:r>
-      <w:proofErr w:type="spellEnd"/>
-      <w:r>
-        <w:rPr>
-          <w:rFonts w:cs="Times New Roman"/>
-        </w:rPr>
-        <w:t>]</w:t>
+      <w:r>
+        <w:rPr>
+          <w:rFonts w:cs="Times New Roman"/>
+        </w:rPr>
+        <w:t>, B &amp; C</w:t>
+      </w:r>
+      <w:r>
+        <w:rPr>
+          <w:rFonts w:cs="Times New Roman"/>
+        </w:rPr>
+        <w:t xml:space="preserve"> is correct answer</w:t>
       </w:r>
     </w:p>
     <w:p>
@@ -19555,22 +18369,8 @@
         <w:rPr>
           <w:rFonts w:cs="Times New Roman"/>
         </w:rPr>
-        <w:t>[Question_start]</w:t>
-      </w:r>
-    </w:p>
-    <w:p>
-      <w:pPr>
-        <w:tabs>
-          <w:tab w:val="left" w:pos="709"/>
-          <w:tab w:val="left" w:pos="1134"/>
-          <w:tab w:val="left" w:pos="2694"/>
-        </w:tabs>
-        <w:spacing w:after="0"/>
-        <w:ind w:left="709" w:hanging="709"/>
-        <w:rPr>
-          <w:rFonts w:cs="Times New Roman"/>
-        </w:rPr>
-      </w:pPr>
+        <w:t>Q</w:t>
+      </w:r>
       <w:r>
         <w:rPr>
           <w:rFonts w:cs="Times New Roman"/>
@@ -19581,7 +18381,13 @@
         <w:rPr>
           <w:rFonts w:cs="Times New Roman"/>
         </w:rPr>
-        <w:t xml:space="preserve">. </w:t>
+        <w:t>)</w:t>
+      </w:r>
+      <w:r>
+        <w:rPr>
+          <w:rFonts w:cs="Times New Roman"/>
+        </w:rPr>
+        <w:t xml:space="preserve"> </w:t>
       </w:r>
       <w:r>
         <w:rPr>
@@ -20483,7 +19289,7 @@
         <w:rPr>
           <w:rFonts w:cs="Times New Roman"/>
         </w:rPr>
-        <w:t>[solution]</w:t>
+        <w:t>Answer: A</w:t>
       </w:r>
     </w:p>
     <w:p>
@@ -20503,7 +19309,7 @@
         <w:rPr>
           <w:rFonts w:cs="Times New Roman"/>
         </w:rPr>
-        <w:t>Option A</w:t>
+        <w:t>Explanation:</w:t>
       </w:r>
     </w:p>
     <w:p>
@@ -20523,21 +19329,7 @@
         <w:rPr>
           <w:rFonts w:cs="Times New Roman"/>
         </w:rPr>
-        <w:t>[</w:t>
-      </w:r>
-      <w:proofErr w:type="spellStart"/>
-      <w:r>
-        <w:rPr>
-          <w:rFonts w:cs="Times New Roman"/>
-        </w:rPr>
-        <w:t>Question_end</w:t>
-      </w:r>
-      <w:proofErr w:type="spellEnd"/>
-      <w:r>
-        <w:rPr>
-          <w:rFonts w:cs="Times New Roman"/>
-        </w:rPr>
-        <w:t>]</w:t>
+        <w:t>Option A is correct answer</w:t>
       </w:r>
     </w:p>
     <w:p>
@@ -21732,6 +20524,7 @@
   <w:style w:type="character" w:default="1" w:styleId="DefaultParagraphFont">
     <w:name w:val="Default Paragraph Font"/>
     <w:uiPriority w:val="1"/>
+    <w:semiHidden/>
     <w:unhideWhenUsed/>
   </w:style>
   <w:style w:type="table" w:default="1" w:styleId="TableNormal">

</xml_diff>